<commit_message>
Add probability calibration analysis: reliability diagrams, Brier score, prior correction
</commit_message>
<xml_diff>
--- a/report/technical_report.docx
+++ b/report/technical_report.docx
@@ -383,6 +383,92 @@
           <w:sz w:val="21"/>
         </w:rPr>
         <w:t xml:space="preserve"> at an operational threshold. Any claim about the forecasting skill of these models should therefore be based on time-respecting validation.</w:t>
+      </w:r>
+    </w:p>
+    <w:p>
+      <w:pPr>
+        <w:spacing w:after="140" w:before="0" w:line="312" w:lineRule="auto"/>
+      </w:pPr>
+      <w:r>
+        <w:rPr>
+          <w:rFonts w:ascii="Times New Roman" w:hAnsi="Times New Roman" w:eastAsia="宋体"/>
+          <w:b w:val="0"/>
+          <w:i w:val="0"/>
+          <w:sz w:val="21"/>
+        </w:rPr>
+        <w:t xml:space="preserve">A final check concerns the probability scale. Class weighting, which is needed here because positives are rare, makes the fit behave as if the base rate were 0.50. The logistic regression’s mean predicted probability is </w:t>
+      </w:r>
+      <w:r>
+        <w:rPr>
+          <w:rFonts w:ascii="Times New Roman" w:hAnsi="Times New Roman" w:eastAsia="宋体"/>
+          <w:b w:val="0"/>
+          <w:i w:val="0"/>
+          <w:sz w:val="21"/>
+        </w:rPr>
+        <w:t>0.333</w:t>
+      </w:r>
+      <w:r>
+        <w:rPr>
+          <w:rFonts w:ascii="Times New Roman" w:hAnsi="Times New Roman" w:eastAsia="宋体"/>
+          <w:b w:val="0"/>
+          <w:i w:val="0"/>
+          <w:sz w:val="21"/>
+        </w:rPr>
+        <w:t xml:space="preserve"> against an observed rate of </w:t>
+      </w:r>
+      <w:r>
+        <w:rPr>
+          <w:rFonts w:ascii="Times New Roman" w:hAnsi="Times New Roman" w:eastAsia="宋体"/>
+          <w:b w:val="0"/>
+          <w:i w:val="0"/>
+          <w:sz w:val="21"/>
+        </w:rPr>
+        <w:t>0.0427</w:t>
+      </w:r>
+      <w:r>
+        <w:rPr>
+          <w:rFonts w:ascii="Times New Roman" w:hAnsi="Times New Roman" w:eastAsia="宋体"/>
+          <w:b w:val="0"/>
+          <w:i w:val="0"/>
+          <w:sz w:val="21"/>
+        </w:rPr>
+        <w:t xml:space="preserve">; a single log-odds shift reduces the expected calibration error from </w:t>
+      </w:r>
+      <w:r>
+        <w:rPr>
+          <w:rFonts w:ascii="Times New Roman" w:hAnsi="Times New Roman" w:eastAsia="宋体"/>
+          <w:b w:val="0"/>
+          <w:i w:val="0"/>
+          <w:sz w:val="21"/>
+        </w:rPr>
+        <w:t>0.290</w:t>
+      </w:r>
+      <w:r>
+        <w:rPr>
+          <w:rFonts w:ascii="Times New Roman" w:hAnsi="Times New Roman" w:eastAsia="宋体"/>
+          <w:b w:val="0"/>
+          <w:i w:val="0"/>
+          <w:sz w:val="21"/>
+        </w:rPr>
+        <w:t xml:space="preserve"> to </w:t>
+      </w:r>
+      <w:r>
+        <w:rPr>
+          <w:rFonts w:ascii="Times New Roman" w:hAnsi="Times New Roman" w:eastAsia="宋体"/>
+          <w:b w:val="0"/>
+          <w:i w:val="0"/>
+          <w:sz w:val="21"/>
+        </w:rPr>
+        <w:t>0.0144</w:t>
+      </w:r>
+      <w:r>
+        <w:rPr>
+          <w:rFonts w:ascii="Times New Roman" w:hAnsi="Times New Roman" w:eastAsia="宋体"/>
+          <w:b w:val="0"/>
+          <w:i w:val="0"/>
+          <w:sz w:val="21"/>
+        </w:rPr>
+        <w:t>. The same correction over-corrects the tree ensemble, which is already close to calibrated. Ranking metrics are blind to all of this.</w:t>
       </w:r>
     </w:p>
     <w:p>
@@ -4592,6 +4678,1199 @@
     </w:p>
     <w:p>
       <w:pPr>
+        <w:spacing w:after="80" w:before="180" w:line="312" w:lineRule="auto"/>
+      </w:pPr>
+      <w:r>
+        <w:rPr>
+          <w:rFonts w:ascii="Times New Roman" w:hAnsi="Times New Roman" w:eastAsia="宋体"/>
+          <w:b/>
+          <w:i w:val="0"/>
+          <w:sz w:val="23"/>
+        </w:rPr>
+        <w:t>4.5  Probability calibration</w:t>
+      </w:r>
+    </w:p>
+    <w:p>
+      <w:pPr>
+        <w:spacing w:after="140" w:before="0" w:line="312" w:lineRule="auto"/>
+      </w:pPr>
+      <w:r>
+        <w:rPr>
+          <w:rFonts w:ascii="Times New Roman" w:hAnsi="Times New Roman" w:eastAsia="宋体"/>
+          <w:b w:val="0"/>
+          <w:i w:val="0"/>
+          <w:sz w:val="21"/>
+        </w:rPr>
+        <w:t>Class weights are what make these models usable on a 6.6 %-positive dataset, but they have a side effect: the fit behaves as if the base rate were 0.50, so the output probabilities sit on the wrong scale. Ranking metrics are blind to this, because they depend only on the order of the scores. For an early-warning system, however, the difference between “8 % chance” and “33 % chance” is the difference between a usable threshold rule and a useless one.</w:t>
+      </w:r>
+    </w:p>
+    <w:tbl>
+      <w:tblPr>
+        <w:tblStyle w:val="TableGrid"/>
+        <w:tblW w:type="auto" w:w="0"/>
+        <w:jc w:val="center"/>
+        <w:tblLook w:firstColumn="1" w:firstRow="1" w:lastColumn="0" w:lastRow="0" w:noHBand="0" w:noVBand="1" w:val="04A0"/>
+      </w:tblPr>
+      <w:tblGrid>
+        <w:gridCol w:w="1170"/>
+        <w:gridCol w:w="1170"/>
+        <w:gridCol w:w="1170"/>
+        <w:gridCol w:w="1170"/>
+        <w:gridCol w:w="1170"/>
+        <w:gridCol w:w="1170"/>
+        <w:gridCol w:w="1170"/>
+        <w:gridCol w:w="1170"/>
+      </w:tblGrid>
+      <w:tr>
+        <w:tc>
+          <w:tcPr>
+            <w:tcW w:type="dxa" w:w="936"/>
+          </w:tcPr>
+          <w:p>
+            <w:pPr>
+              <w:spacing w:after="30" w:line="252" w:lineRule="auto"/>
+            </w:pPr>
+            <w:r/>
+            <w:r>
+              <w:rPr>
+                <w:rFonts w:ascii="Times New Roman" w:hAnsi="Times New Roman" w:eastAsia="宋体"/>
+                <w:b/>
+                <w:i w:val="0"/>
+                <w:sz w:val="17"/>
+              </w:rPr>
+              <w:t>Model</w:t>
+            </w:r>
+          </w:p>
+        </w:tc>
+        <w:tc>
+          <w:tcPr>
+            <w:tcW w:type="dxa" w:w="2520"/>
+          </w:tcPr>
+          <w:p>
+            <w:pPr>
+              <w:spacing w:after="30" w:line="252" w:lineRule="auto"/>
+            </w:pPr>
+            <w:r/>
+            <w:r>
+              <w:rPr>
+                <w:rFonts w:ascii="Times New Roman" w:hAnsi="Times New Roman" w:eastAsia="宋体"/>
+                <w:b/>
+                <w:i w:val="0"/>
+                <w:sz w:val="17"/>
+              </w:rPr>
+              <w:t>Variant</w:t>
+            </w:r>
+          </w:p>
+        </w:tc>
+        <w:tc>
+          <w:tcPr>
+            <w:tcW w:type="dxa" w:w="1008"/>
+          </w:tcPr>
+          <w:p>
+            <w:pPr>
+              <w:spacing w:after="30" w:line="252" w:lineRule="auto"/>
+            </w:pPr>
+            <w:r/>
+            <w:r>
+              <w:rPr>
+                <w:rFonts w:ascii="Times New Roman" w:hAnsi="Times New Roman" w:eastAsia="宋体"/>
+                <w:b/>
+                <w:i w:val="0"/>
+                <w:sz w:val="17"/>
+              </w:rPr>
+              <w:t>Brier</w:t>
+            </w:r>
+          </w:p>
+        </w:tc>
+        <w:tc>
+          <w:tcPr>
+            <w:tcW w:type="dxa" w:w="864"/>
+          </w:tcPr>
+          <w:p>
+            <w:pPr>
+              <w:spacing w:after="30" w:line="252" w:lineRule="auto"/>
+            </w:pPr>
+            <w:r/>
+            <w:r>
+              <w:rPr>
+                <w:rFonts w:ascii="Times New Roman" w:hAnsi="Times New Roman" w:eastAsia="宋体"/>
+                <w:b/>
+                <w:i w:val="0"/>
+                <w:sz w:val="17"/>
+              </w:rPr>
+              <w:t>Skill</w:t>
+            </w:r>
+          </w:p>
+        </w:tc>
+        <w:tc>
+          <w:tcPr>
+            <w:tcW w:type="dxa" w:w="936"/>
+          </w:tcPr>
+          <w:p>
+            <w:pPr>
+              <w:spacing w:after="30" w:line="252" w:lineRule="auto"/>
+            </w:pPr>
+            <w:r/>
+            <w:r>
+              <w:rPr>
+                <w:rFonts w:ascii="Times New Roman" w:hAnsi="Times New Roman" w:eastAsia="宋体"/>
+                <w:b/>
+                <w:i w:val="0"/>
+                <w:sz w:val="17"/>
+              </w:rPr>
+              <w:t>ECE</w:t>
+            </w:r>
+          </w:p>
+        </w:tc>
+        <w:tc>
+          <w:tcPr>
+            <w:tcW w:type="dxa" w:w="936"/>
+          </w:tcPr>
+          <w:p>
+            <w:pPr>
+              <w:spacing w:after="30" w:line="252" w:lineRule="auto"/>
+            </w:pPr>
+            <w:r/>
+            <w:r>
+              <w:rPr>
+                <w:rFonts w:ascii="Times New Roman" w:hAnsi="Times New Roman" w:eastAsia="宋体"/>
+                <w:b/>
+                <w:i w:val="0"/>
+                <w:sz w:val="17"/>
+              </w:rPr>
+              <w:t>MCE</w:t>
+            </w:r>
+          </w:p>
+        </w:tc>
+        <w:tc>
+          <w:tcPr>
+            <w:tcW w:type="dxa" w:w="1368"/>
+          </w:tcPr>
+          <w:p>
+            <w:pPr>
+              <w:spacing w:after="30" w:line="252" w:lineRule="auto"/>
+            </w:pPr>
+            <w:r/>
+            <w:r>
+              <w:rPr>
+                <w:rFonts w:ascii="Times New Roman" w:hAnsi="Times New Roman" w:eastAsia="宋体"/>
+                <w:b/>
+                <w:i w:val="0"/>
+                <w:sz w:val="17"/>
+              </w:rPr>
+              <w:t>Mean predicted</w:t>
+            </w:r>
+          </w:p>
+        </w:tc>
+        <w:tc>
+          <w:tcPr>
+            <w:tcW w:type="dxa" w:w="1080"/>
+          </w:tcPr>
+          <w:p>
+            <w:pPr>
+              <w:spacing w:after="30" w:line="252" w:lineRule="auto"/>
+            </w:pPr>
+            <w:r/>
+            <w:r>
+              <w:rPr>
+                <w:rFonts w:ascii="Times New Roman" w:hAnsi="Times New Roman" w:eastAsia="宋体"/>
+                <w:b/>
+                <w:i w:val="0"/>
+                <w:sz w:val="17"/>
+              </w:rPr>
+              <w:t>Observed</w:t>
+            </w:r>
+          </w:p>
+        </w:tc>
+      </w:tr>
+      <w:tr>
+        <w:tc>
+          <w:tcPr>
+            <w:tcW w:type="dxa" w:w="936"/>
+          </w:tcPr>
+          <w:p>
+            <w:pPr>
+              <w:spacing w:after="30" w:line="252" w:lineRule="auto"/>
+            </w:pPr>
+            <w:r/>
+            <w:r>
+              <w:rPr>
+                <w:rFonts w:ascii="Times New Roman" w:hAnsi="Times New Roman" w:eastAsia="宋体"/>
+                <w:b w:val="0"/>
+                <w:i w:val="0"/>
+                <w:sz w:val="17"/>
+              </w:rPr>
+              <w:t>LR</w:t>
+            </w:r>
+          </w:p>
+        </w:tc>
+        <w:tc>
+          <w:tcPr>
+            <w:tcW w:type="dxa" w:w="2520"/>
+          </w:tcPr>
+          <w:p>
+            <w:pPr>
+              <w:spacing w:after="30" w:line="252" w:lineRule="auto"/>
+            </w:pPr>
+            <w:r/>
+            <w:r>
+              <w:rPr>
+                <w:rFonts w:ascii="Times New Roman" w:hAnsi="Times New Roman" w:eastAsia="宋体"/>
+                <w:b w:val="0"/>
+                <w:i w:val="0"/>
+                <w:sz w:val="17"/>
+              </w:rPr>
+              <w:t>as fitted (class-weighted)</w:t>
+            </w:r>
+          </w:p>
+        </w:tc>
+        <w:tc>
+          <w:tcPr>
+            <w:tcW w:type="dxa" w:w="1008"/>
+          </w:tcPr>
+          <w:p>
+            <w:pPr>
+              <w:spacing w:after="30" w:line="252" w:lineRule="auto"/>
+            </w:pPr>
+            <w:r/>
+            <w:r>
+              <w:rPr>
+                <w:rFonts w:ascii="Times New Roman" w:hAnsi="Times New Roman" w:eastAsia="宋体"/>
+                <w:b w:val="0"/>
+                <w:i w:val="0"/>
+                <w:sz w:val="17"/>
+              </w:rPr>
+              <w:t>0.1462</w:t>
+            </w:r>
+          </w:p>
+        </w:tc>
+        <w:tc>
+          <w:tcPr>
+            <w:tcW w:type="dxa" w:w="864"/>
+          </w:tcPr>
+          <w:p>
+            <w:pPr>
+              <w:spacing w:after="30" w:line="252" w:lineRule="auto"/>
+            </w:pPr>
+            <w:r/>
+            <w:r>
+              <w:rPr>
+                <w:rFonts w:ascii="Times New Roman" w:hAnsi="Times New Roman" w:eastAsia="宋体"/>
+                <w:b w:val="0"/>
+                <w:i w:val="0"/>
+                <w:sz w:val="17"/>
+              </w:rPr>
+              <w:t>-2.579</w:t>
+            </w:r>
+          </w:p>
+        </w:tc>
+        <w:tc>
+          <w:tcPr>
+            <w:tcW w:type="dxa" w:w="936"/>
+          </w:tcPr>
+          <w:p>
+            <w:pPr>
+              <w:spacing w:after="30" w:line="252" w:lineRule="auto"/>
+            </w:pPr>
+            <w:r/>
+            <w:r>
+              <w:rPr>
+                <w:rFonts w:ascii="Times New Roman" w:hAnsi="Times New Roman" w:eastAsia="宋体"/>
+                <w:b w:val="0"/>
+                <w:i w:val="0"/>
+                <w:sz w:val="17"/>
+              </w:rPr>
+              <w:t>0.2904</w:t>
+            </w:r>
+          </w:p>
+        </w:tc>
+        <w:tc>
+          <w:tcPr>
+            <w:tcW w:type="dxa" w:w="936"/>
+          </w:tcPr>
+          <w:p>
+            <w:pPr>
+              <w:spacing w:after="30" w:line="252" w:lineRule="auto"/>
+            </w:pPr>
+            <w:r/>
+            <w:r>
+              <w:rPr>
+                <w:rFonts w:ascii="Times New Roman" w:hAnsi="Times New Roman" w:eastAsia="宋体"/>
+                <w:b w:val="0"/>
+                <w:i w:val="0"/>
+                <w:sz w:val="17"/>
+              </w:rPr>
+              <w:t>0.5701</w:t>
+            </w:r>
+          </w:p>
+        </w:tc>
+        <w:tc>
+          <w:tcPr>
+            <w:tcW w:type="dxa" w:w="1368"/>
+          </w:tcPr>
+          <w:p>
+            <w:pPr>
+              <w:spacing w:after="30" w:line="252" w:lineRule="auto"/>
+            </w:pPr>
+            <w:r/>
+            <w:r>
+              <w:rPr>
+                <w:rFonts w:ascii="Times New Roman" w:hAnsi="Times New Roman" w:eastAsia="宋体"/>
+                <w:b w:val="0"/>
+                <w:i w:val="0"/>
+                <w:sz w:val="17"/>
+              </w:rPr>
+              <w:t>0.3331</w:t>
+            </w:r>
+          </w:p>
+        </w:tc>
+        <w:tc>
+          <w:tcPr>
+            <w:tcW w:type="dxa" w:w="1080"/>
+          </w:tcPr>
+          <w:p>
+            <w:pPr>
+              <w:spacing w:after="30" w:line="252" w:lineRule="auto"/>
+            </w:pPr>
+            <w:r/>
+            <w:r>
+              <w:rPr>
+                <w:rFonts w:ascii="Times New Roman" w:hAnsi="Times New Roman" w:eastAsia="宋体"/>
+                <w:b w:val="0"/>
+                <w:i w:val="0"/>
+                <w:sz w:val="17"/>
+              </w:rPr>
+              <w:t>0.0427</w:t>
+            </w:r>
+          </w:p>
+        </w:tc>
+      </w:tr>
+      <w:tr>
+        <w:tc>
+          <w:tcPr>
+            <w:tcW w:type="dxa" w:w="936"/>
+          </w:tcPr>
+          <w:p>
+            <w:pPr>
+              <w:spacing w:after="30" w:line="252" w:lineRule="auto"/>
+            </w:pPr>
+            <w:r/>
+            <w:r>
+              <w:rPr>
+                <w:rFonts w:ascii="Times New Roman" w:hAnsi="Times New Roman" w:eastAsia="宋体"/>
+                <w:b w:val="0"/>
+                <w:i w:val="0"/>
+                <w:sz w:val="17"/>
+              </w:rPr>
+              <w:t>LR</w:t>
+            </w:r>
+          </w:p>
+        </w:tc>
+        <w:tc>
+          <w:tcPr>
+            <w:tcW w:type="dxa" w:w="2520"/>
+          </w:tcPr>
+          <w:p>
+            <w:pPr>
+              <w:spacing w:after="30" w:line="252" w:lineRule="auto"/>
+            </w:pPr>
+            <w:r/>
+            <w:r>
+              <w:rPr>
+                <w:rFonts w:ascii="Times New Roman" w:hAnsi="Times New Roman" w:eastAsia="宋体"/>
+                <w:b w:val="0"/>
+                <w:i w:val="0"/>
+                <w:sz w:val="17"/>
+              </w:rPr>
+              <w:t>after prior correction</w:t>
+            </w:r>
+          </w:p>
+        </w:tc>
+        <w:tc>
+          <w:tcPr>
+            <w:tcW w:type="dxa" w:w="1008"/>
+          </w:tcPr>
+          <w:p>
+            <w:pPr>
+              <w:spacing w:after="30" w:line="252" w:lineRule="auto"/>
+            </w:pPr>
+            <w:r/>
+            <w:r>
+              <w:rPr>
+                <w:rFonts w:ascii="Times New Roman" w:hAnsi="Times New Roman" w:eastAsia="宋体"/>
+                <w:b w:val="0"/>
+                <w:i w:val="0"/>
+                <w:sz w:val="17"/>
+              </w:rPr>
+              <w:t>0.0414</w:t>
+            </w:r>
+          </w:p>
+        </w:tc>
+        <w:tc>
+          <w:tcPr>
+            <w:tcW w:type="dxa" w:w="864"/>
+          </w:tcPr>
+          <w:p>
+            <w:pPr>
+              <w:spacing w:after="30" w:line="252" w:lineRule="auto"/>
+            </w:pPr>
+            <w:r/>
+            <w:r>
+              <w:rPr>
+                <w:rFonts w:ascii="Times New Roman" w:hAnsi="Times New Roman" w:eastAsia="宋体"/>
+                <w:b w:val="0"/>
+                <w:i w:val="0"/>
+                <w:sz w:val="17"/>
+              </w:rPr>
+              <w:t>-0.013</w:t>
+            </w:r>
+          </w:p>
+        </w:tc>
+        <w:tc>
+          <w:tcPr>
+            <w:tcW w:type="dxa" w:w="936"/>
+          </w:tcPr>
+          <w:p>
+            <w:pPr>
+              <w:spacing w:after="30" w:line="252" w:lineRule="auto"/>
+            </w:pPr>
+            <w:r/>
+            <w:r>
+              <w:rPr>
+                <w:rFonts w:ascii="Times New Roman" w:hAnsi="Times New Roman" w:eastAsia="宋体"/>
+                <w:b w:val="0"/>
+                <w:i w:val="0"/>
+                <w:sz w:val="17"/>
+              </w:rPr>
+              <w:t>0.0144</w:t>
+            </w:r>
+          </w:p>
+        </w:tc>
+        <w:tc>
+          <w:tcPr>
+            <w:tcW w:type="dxa" w:w="936"/>
+          </w:tcPr>
+          <w:p>
+            <w:pPr>
+              <w:spacing w:after="30" w:line="252" w:lineRule="auto"/>
+            </w:pPr>
+            <w:r/>
+            <w:r>
+              <w:rPr>
+                <w:rFonts w:ascii="Times New Roman" w:hAnsi="Times New Roman" w:eastAsia="宋体"/>
+                <w:b w:val="0"/>
+                <w:i w:val="0"/>
+                <w:sz w:val="17"/>
+              </w:rPr>
+              <w:t>0.0413</w:t>
+            </w:r>
+          </w:p>
+        </w:tc>
+        <w:tc>
+          <w:tcPr>
+            <w:tcW w:type="dxa" w:w="1368"/>
+          </w:tcPr>
+          <w:p>
+            <w:pPr>
+              <w:spacing w:after="30" w:line="252" w:lineRule="auto"/>
+            </w:pPr>
+            <w:r/>
+            <w:r>
+              <w:rPr>
+                <w:rFonts w:ascii="Times New Roman" w:hAnsi="Times New Roman" w:eastAsia="宋体"/>
+                <w:b w:val="0"/>
+                <w:i w:val="0"/>
+                <w:sz w:val="17"/>
+              </w:rPr>
+              <w:t>0.0436</w:t>
+            </w:r>
+          </w:p>
+        </w:tc>
+        <w:tc>
+          <w:tcPr>
+            <w:tcW w:type="dxa" w:w="1080"/>
+          </w:tcPr>
+          <w:p>
+            <w:pPr>
+              <w:spacing w:after="30" w:line="252" w:lineRule="auto"/>
+            </w:pPr>
+            <w:r/>
+            <w:r>
+              <w:rPr>
+                <w:rFonts w:ascii="Times New Roman" w:hAnsi="Times New Roman" w:eastAsia="宋体"/>
+                <w:b w:val="0"/>
+                <w:i w:val="0"/>
+                <w:sz w:val="17"/>
+              </w:rPr>
+              <w:t>0.0427</w:t>
+            </w:r>
+          </w:p>
+        </w:tc>
+      </w:tr>
+      <w:tr>
+        <w:tc>
+          <w:tcPr>
+            <w:tcW w:type="dxa" w:w="936"/>
+          </w:tcPr>
+          <w:p>
+            <w:pPr>
+              <w:spacing w:after="30" w:line="252" w:lineRule="auto"/>
+            </w:pPr>
+            <w:r/>
+            <w:r>
+              <w:rPr>
+                <w:rFonts w:ascii="Times New Roman" w:hAnsi="Times New Roman" w:eastAsia="宋体"/>
+                <w:b w:val="0"/>
+                <w:i w:val="0"/>
+                <w:sz w:val="17"/>
+              </w:rPr>
+              <w:t>CART</w:t>
+            </w:r>
+          </w:p>
+        </w:tc>
+        <w:tc>
+          <w:tcPr>
+            <w:tcW w:type="dxa" w:w="2520"/>
+          </w:tcPr>
+          <w:p>
+            <w:pPr>
+              <w:spacing w:after="30" w:line="252" w:lineRule="auto"/>
+            </w:pPr>
+            <w:r/>
+            <w:r>
+              <w:rPr>
+                <w:rFonts w:ascii="Times New Roman" w:hAnsi="Times New Roman" w:eastAsia="宋体"/>
+                <w:b w:val="0"/>
+                <w:i w:val="0"/>
+                <w:sz w:val="17"/>
+              </w:rPr>
+              <w:t>as fitted (class-weighted)</w:t>
+            </w:r>
+          </w:p>
+        </w:tc>
+        <w:tc>
+          <w:tcPr>
+            <w:tcW w:type="dxa" w:w="1008"/>
+          </w:tcPr>
+          <w:p>
+            <w:pPr>
+              <w:spacing w:after="30" w:line="252" w:lineRule="auto"/>
+            </w:pPr>
+            <w:r/>
+            <w:r>
+              <w:rPr>
+                <w:rFonts w:ascii="Times New Roman" w:hAnsi="Times New Roman" w:eastAsia="宋体"/>
+                <w:b w:val="0"/>
+                <w:i w:val="0"/>
+                <w:sz w:val="17"/>
+              </w:rPr>
+              <w:t>0.0433</w:t>
+            </w:r>
+          </w:p>
+        </w:tc>
+        <w:tc>
+          <w:tcPr>
+            <w:tcW w:type="dxa" w:w="864"/>
+          </w:tcPr>
+          <w:p>
+            <w:pPr>
+              <w:spacing w:after="30" w:line="252" w:lineRule="auto"/>
+            </w:pPr>
+            <w:r/>
+            <w:r>
+              <w:rPr>
+                <w:rFonts w:ascii="Times New Roman" w:hAnsi="Times New Roman" w:eastAsia="宋体"/>
+                <w:b w:val="0"/>
+                <w:i w:val="0"/>
+                <w:sz w:val="17"/>
+              </w:rPr>
+              <w:t>-0.061</w:t>
+            </w:r>
+          </w:p>
+        </w:tc>
+        <w:tc>
+          <w:tcPr>
+            <w:tcW w:type="dxa" w:w="936"/>
+          </w:tcPr>
+          <w:p>
+            <w:pPr>
+              <w:spacing w:after="30" w:line="252" w:lineRule="auto"/>
+            </w:pPr>
+            <w:r/>
+            <w:r>
+              <w:rPr>
+                <w:rFonts w:ascii="Times New Roman" w:hAnsi="Times New Roman" w:eastAsia="宋体"/>
+                <w:b w:val="0"/>
+                <w:i w:val="0"/>
+                <w:sz w:val="17"/>
+              </w:rPr>
+              <w:t>0.0374</w:t>
+            </w:r>
+          </w:p>
+        </w:tc>
+        <w:tc>
+          <w:tcPr>
+            <w:tcW w:type="dxa" w:w="936"/>
+          </w:tcPr>
+          <w:p>
+            <w:pPr>
+              <w:spacing w:after="30" w:line="252" w:lineRule="auto"/>
+            </w:pPr>
+            <w:r/>
+            <w:r>
+              <w:rPr>
+                <w:rFonts w:ascii="Times New Roman" w:hAnsi="Times New Roman" w:eastAsia="宋体"/>
+                <w:b w:val="0"/>
+                <w:i w:val="0"/>
+                <w:sz w:val="17"/>
+              </w:rPr>
+              <w:t>0.1219</w:t>
+            </w:r>
+          </w:p>
+        </w:tc>
+        <w:tc>
+          <w:tcPr>
+            <w:tcW w:type="dxa" w:w="1368"/>
+          </w:tcPr>
+          <w:p>
+            <w:pPr>
+              <w:spacing w:after="30" w:line="252" w:lineRule="auto"/>
+            </w:pPr>
+            <w:r/>
+            <w:r>
+              <w:rPr>
+                <w:rFonts w:ascii="Times New Roman" w:hAnsi="Times New Roman" w:eastAsia="宋体"/>
+                <w:b w:val="0"/>
+                <w:i w:val="0"/>
+                <w:sz w:val="17"/>
+              </w:rPr>
+              <w:t>0.0662</w:t>
+            </w:r>
+          </w:p>
+        </w:tc>
+        <w:tc>
+          <w:tcPr>
+            <w:tcW w:type="dxa" w:w="1080"/>
+          </w:tcPr>
+          <w:p>
+            <w:pPr>
+              <w:spacing w:after="30" w:line="252" w:lineRule="auto"/>
+            </w:pPr>
+            <w:r/>
+            <w:r>
+              <w:rPr>
+                <w:rFonts w:ascii="Times New Roman" w:hAnsi="Times New Roman" w:eastAsia="宋体"/>
+                <w:b w:val="0"/>
+                <w:i w:val="0"/>
+                <w:sz w:val="17"/>
+              </w:rPr>
+              <w:t>0.0427</w:t>
+            </w:r>
+          </w:p>
+        </w:tc>
+      </w:tr>
+      <w:tr>
+        <w:tc>
+          <w:tcPr>
+            <w:tcW w:type="dxa" w:w="936"/>
+          </w:tcPr>
+          <w:p>
+            <w:pPr>
+              <w:spacing w:after="30" w:line="252" w:lineRule="auto"/>
+            </w:pPr>
+            <w:r/>
+            <w:r>
+              <w:rPr>
+                <w:rFonts w:ascii="Times New Roman" w:hAnsi="Times New Roman" w:eastAsia="宋体"/>
+                <w:b w:val="0"/>
+                <w:i w:val="0"/>
+                <w:sz w:val="17"/>
+              </w:rPr>
+              <w:t>CART</w:t>
+            </w:r>
+          </w:p>
+        </w:tc>
+        <w:tc>
+          <w:tcPr>
+            <w:tcW w:type="dxa" w:w="2520"/>
+          </w:tcPr>
+          <w:p>
+            <w:pPr>
+              <w:spacing w:after="30" w:line="252" w:lineRule="auto"/>
+            </w:pPr>
+            <w:r/>
+            <w:r>
+              <w:rPr>
+                <w:rFonts w:ascii="Times New Roman" w:hAnsi="Times New Roman" w:eastAsia="宋体"/>
+                <w:b w:val="0"/>
+                <w:i w:val="0"/>
+                <w:sz w:val="17"/>
+              </w:rPr>
+              <w:t>after prior correction</w:t>
+            </w:r>
+          </w:p>
+        </w:tc>
+        <w:tc>
+          <w:tcPr>
+            <w:tcW w:type="dxa" w:w="1008"/>
+          </w:tcPr>
+          <w:p>
+            <w:pPr>
+              <w:spacing w:after="30" w:line="252" w:lineRule="auto"/>
+            </w:pPr>
+            <w:r/>
+            <w:r>
+              <w:rPr>
+                <w:rFonts w:ascii="Times New Roman" w:hAnsi="Times New Roman" w:eastAsia="宋体"/>
+                <w:b w:val="0"/>
+                <w:i w:val="0"/>
+                <w:sz w:val="17"/>
+              </w:rPr>
+              <w:t>0.0420</w:t>
+            </w:r>
+          </w:p>
+        </w:tc>
+        <w:tc>
+          <w:tcPr>
+            <w:tcW w:type="dxa" w:w="864"/>
+          </w:tcPr>
+          <w:p>
+            <w:pPr>
+              <w:spacing w:after="30" w:line="252" w:lineRule="auto"/>
+            </w:pPr>
+            <w:r/>
+            <w:r>
+              <w:rPr>
+                <w:rFonts w:ascii="Times New Roman" w:hAnsi="Times New Roman" w:eastAsia="宋体"/>
+                <w:b w:val="0"/>
+                <w:i w:val="0"/>
+                <w:sz w:val="17"/>
+              </w:rPr>
+              <w:t>-0.028</w:t>
+            </w:r>
+          </w:p>
+        </w:tc>
+        <w:tc>
+          <w:tcPr>
+            <w:tcW w:type="dxa" w:w="936"/>
+          </w:tcPr>
+          <w:p>
+            <w:pPr>
+              <w:spacing w:after="30" w:line="252" w:lineRule="auto"/>
+            </w:pPr>
+            <w:r/>
+            <w:r>
+              <w:rPr>
+                <w:rFonts w:ascii="Times New Roman" w:hAnsi="Times New Roman" w:eastAsia="宋体"/>
+                <w:b w:val="0"/>
+                <w:i w:val="0"/>
+                <w:sz w:val="17"/>
+              </w:rPr>
+              <w:t>0.0372</w:t>
+            </w:r>
+          </w:p>
+        </w:tc>
+        <w:tc>
+          <w:tcPr>
+            <w:tcW w:type="dxa" w:w="936"/>
+          </w:tcPr>
+          <w:p>
+            <w:pPr>
+              <w:spacing w:after="30" w:line="252" w:lineRule="auto"/>
+            </w:pPr>
+            <w:r/>
+            <w:r>
+              <w:rPr>
+                <w:rFonts w:ascii="Times New Roman" w:hAnsi="Times New Roman" w:eastAsia="宋体"/>
+                <w:b w:val="0"/>
+                <w:i w:val="0"/>
+                <w:sz w:val="17"/>
+              </w:rPr>
+              <w:t>0.0935</w:t>
+            </w:r>
+          </w:p>
+        </w:tc>
+        <w:tc>
+          <w:tcPr>
+            <w:tcW w:type="dxa" w:w="1368"/>
+          </w:tcPr>
+          <w:p>
+            <w:pPr>
+              <w:spacing w:after="30" w:line="252" w:lineRule="auto"/>
+            </w:pPr>
+            <w:r/>
+            <w:r>
+              <w:rPr>
+                <w:rFonts w:ascii="Times New Roman" w:hAnsi="Times New Roman" w:eastAsia="宋体"/>
+                <w:b w:val="0"/>
+                <w:i w:val="0"/>
+                <w:sz w:val="17"/>
+              </w:rPr>
+              <w:t>0.0055</w:t>
+            </w:r>
+          </w:p>
+        </w:tc>
+        <w:tc>
+          <w:tcPr>
+            <w:tcW w:type="dxa" w:w="1080"/>
+          </w:tcPr>
+          <w:p>
+            <w:pPr>
+              <w:spacing w:after="30" w:line="252" w:lineRule="auto"/>
+            </w:pPr>
+            <w:r/>
+            <w:r>
+              <w:rPr>
+                <w:rFonts w:ascii="Times New Roman" w:hAnsi="Times New Roman" w:eastAsia="宋体"/>
+                <w:b w:val="0"/>
+                <w:i w:val="0"/>
+                <w:sz w:val="17"/>
+              </w:rPr>
+              <w:t>0.0427</w:t>
+            </w:r>
+          </w:p>
+        </w:tc>
+      </w:tr>
+    </w:tbl>
+    <w:p>
+      <w:pPr>
+        <w:spacing w:after="240" w:before="0" w:line="312" w:lineRule="auto"/>
+        <w:jc w:val="center"/>
+      </w:pPr>
+      <w:r>
+        <w:rPr>
+          <w:rFonts w:ascii="Times New Roman" w:hAnsi="Times New Roman" w:eastAsia="宋体"/>
+          <w:b w:val="0"/>
+          <w:i/>
+          <w:sz w:val="17"/>
+        </w:rPr>
+        <w:t>Table 8. Probability calibration on the time-ordered out-of-fold predictions. “Skill” is the Brier skill score against always predicting the base rate; ECE is the expected calibration error.</w:t>
+      </w:r>
+    </w:p>
+    <w:p>
+      <w:pPr>
+        <w:spacing w:after="140" w:before="0" w:line="312" w:lineRule="auto"/>
+      </w:pPr>
+      <w:r>
+        <w:rPr>
+          <w:rFonts w:ascii="Times New Roman" w:hAnsi="Times New Roman" w:eastAsia="宋体"/>
+          <w:b w:val="0"/>
+          <w:i w:val="0"/>
+          <w:sz w:val="21"/>
+        </w:rPr>
+        <w:t xml:space="preserve">The logistic regression is severely over-confident as fitted: its mean predicted probability is </w:t>
+      </w:r>
+      <w:r>
+        <w:rPr>
+          <w:rFonts w:ascii="Times New Roman" w:hAnsi="Times New Roman" w:eastAsia="宋体"/>
+          <w:b w:val="0"/>
+          <w:i w:val="0"/>
+          <w:sz w:val="21"/>
+        </w:rPr>
+        <w:t>0.333</w:t>
+      </w:r>
+      <w:r>
+        <w:rPr>
+          <w:rFonts w:ascii="Times New Roman" w:hAnsi="Times New Roman" w:eastAsia="宋体"/>
+          <w:b w:val="0"/>
+          <w:i w:val="0"/>
+          <w:sz w:val="21"/>
+        </w:rPr>
+        <w:t xml:space="preserve"> against an observed rate of </w:t>
+      </w:r>
+      <w:r>
+        <w:rPr>
+          <w:rFonts w:ascii="Times New Roman" w:hAnsi="Times New Roman" w:eastAsia="宋体"/>
+          <w:b w:val="0"/>
+          <w:i w:val="0"/>
+          <w:sz w:val="21"/>
+        </w:rPr>
+        <w:t>0.0427</w:t>
+      </w:r>
+      <w:r>
+        <w:rPr>
+          <w:rFonts w:ascii="Times New Roman" w:hAnsi="Times New Roman" w:eastAsia="宋体"/>
+          <w:b w:val="0"/>
+          <w:i w:val="0"/>
+          <w:sz w:val="21"/>
+        </w:rPr>
+        <w:t xml:space="preserve">, and its ECE is </w:t>
+      </w:r>
+      <w:r>
+        <w:rPr>
+          <w:rFonts w:ascii="Times New Roman" w:hAnsi="Times New Roman" w:eastAsia="宋体"/>
+          <w:b w:val="0"/>
+          <w:i w:val="0"/>
+          <w:sz w:val="21"/>
+        </w:rPr>
+        <w:t>0.290</w:t>
+      </w:r>
+      <w:r>
+        <w:rPr>
+          <w:rFonts w:ascii="Times New Roman" w:hAnsi="Times New Roman" w:eastAsia="宋体"/>
+          <w:b w:val="0"/>
+          <w:i w:val="0"/>
+          <w:sz w:val="21"/>
+        </w:rPr>
+        <w:t xml:space="preserve">. The standard prior correction — a shift of the log-odds by log(π/(1−π)) − log(0.5) — reduces ECE to </w:t>
+      </w:r>
+      <w:r>
+        <w:rPr>
+          <w:rFonts w:ascii="Times New Roman" w:hAnsi="Times New Roman" w:eastAsia="宋体"/>
+          <w:b w:val="0"/>
+          <w:i w:val="0"/>
+          <w:sz w:val="21"/>
+        </w:rPr>
+        <w:t>0.0144</w:t>
+      </w:r>
+      <w:r>
+        <w:rPr>
+          <w:rFonts w:ascii="Times New Roman" w:hAnsi="Times New Roman" w:eastAsia="宋体"/>
+          <w:b w:val="0"/>
+          <w:i w:val="0"/>
+          <w:sz w:val="21"/>
+        </w:rPr>
+        <w:t xml:space="preserve">, a </w:t>
+      </w:r>
+      <w:r>
+        <w:rPr>
+          <w:rFonts w:ascii="Times New Roman" w:hAnsi="Times New Roman" w:eastAsia="宋体"/>
+          <w:b w:val="0"/>
+          <w:i w:val="0"/>
+          <w:sz w:val="21"/>
+        </w:rPr>
+        <w:t>95%</w:t>
+      </w:r>
+      <w:r>
+        <w:rPr>
+          <w:rFonts w:ascii="Times New Roman" w:hAnsi="Times New Roman" w:eastAsia="宋体"/>
+          <w:b w:val="0"/>
+          <w:i w:val="0"/>
+          <w:sz w:val="21"/>
+        </w:rPr>
+        <w:t xml:space="preserve"> reduction, and brings the mean prediction to </w:t>
+      </w:r>
+      <w:r>
+        <w:rPr>
+          <w:rFonts w:ascii="Times New Roman" w:hAnsi="Times New Roman" w:eastAsia="宋体"/>
+          <w:b w:val="0"/>
+          <w:i w:val="0"/>
+          <w:sz w:val="21"/>
+        </w:rPr>
+        <w:t>0.0436</w:t>
+      </w:r>
+      <w:r>
+        <w:rPr>
+          <w:rFonts w:ascii="Times New Roman" w:hAnsi="Times New Roman" w:eastAsia="宋体"/>
+          <w:b w:val="0"/>
+          <w:i w:val="0"/>
+          <w:sz w:val="21"/>
+        </w:rPr>
+        <w:t xml:space="preserve"> against an observed </w:t>
+      </w:r>
+      <w:r>
+        <w:rPr>
+          <w:rFonts w:ascii="Times New Roman" w:hAnsi="Times New Roman" w:eastAsia="宋体"/>
+          <w:b w:val="0"/>
+          <w:i w:val="0"/>
+          <w:sz w:val="21"/>
+        </w:rPr>
+        <w:t>0.0427</w:t>
+      </w:r>
+      <w:r>
+        <w:rPr>
+          <w:rFonts w:ascii="Times New Roman" w:hAnsi="Times New Roman" w:eastAsia="宋体"/>
+          <w:b w:val="0"/>
+          <w:i w:val="0"/>
+          <w:sz w:val="21"/>
+        </w:rPr>
+        <w:t>.</w:t>
+      </w:r>
+    </w:p>
+    <w:p>
+      <w:pPr>
+        <w:spacing w:after="140" w:before="0" w:line="312" w:lineRule="auto"/>
+      </w:pPr>
+      <w:r>
+        <w:rPr>
+          <w:rFonts w:ascii="Times New Roman" w:hAnsi="Times New Roman" w:eastAsia="宋体"/>
+          <w:b w:val="0"/>
+          <w:i w:val="0"/>
+          <w:sz w:val="21"/>
+        </w:rPr>
+        <w:t xml:space="preserve">The bagged CART ensemble is far better calibrated even before correction (mean predicted </w:t>
+      </w:r>
+      <w:r>
+        <w:rPr>
+          <w:rFonts w:ascii="Times New Roman" w:hAnsi="Times New Roman" w:eastAsia="宋体"/>
+          <w:b w:val="0"/>
+          <w:i w:val="0"/>
+          <w:sz w:val="21"/>
+        </w:rPr>
+        <w:t>0.0662</w:t>
+      </w:r>
+      <w:r>
+        <w:rPr>
+          <w:rFonts w:ascii="Times New Roman" w:hAnsi="Times New Roman" w:eastAsia="宋体"/>
+          <w:b w:val="0"/>
+          <w:i w:val="0"/>
+          <w:sz w:val="21"/>
+        </w:rPr>
+        <w:t xml:space="preserve">), because averaging leaf proportions over bootstrap samples already pulls the probabilities back towards the empirical rate. Here the same correction </w:t>
+      </w:r>
+      <w:r>
+        <w:rPr>
+          <w:rFonts w:ascii="Times New Roman" w:hAnsi="Times New Roman" w:eastAsia="宋体"/>
+          <w:b w:val="0"/>
+          <w:i/>
+          <w:sz w:val="21"/>
+        </w:rPr>
+        <w:t>over-corrects</w:t>
+      </w:r>
+      <w:r>
+        <w:rPr>
+          <w:rFonts w:ascii="Times New Roman" w:hAnsi="Times New Roman" w:eastAsia="宋体"/>
+          <w:b w:val="0"/>
+          <w:i w:val="0"/>
+          <w:sz w:val="21"/>
+        </w:rPr>
+        <w:t xml:space="preserve">: the mean prediction falls to </w:t>
+      </w:r>
+      <w:r>
+        <w:rPr>
+          <w:rFonts w:ascii="Times New Roman" w:hAnsi="Times New Roman" w:eastAsia="宋体"/>
+          <w:b w:val="0"/>
+          <w:i w:val="0"/>
+          <w:sz w:val="21"/>
+        </w:rPr>
+        <w:t>0.0055</w:t>
+      </w:r>
+      <w:r>
+        <w:rPr>
+          <w:rFonts w:ascii="Times New Roman" w:hAnsi="Times New Roman" w:eastAsia="宋体"/>
+          <w:b w:val="0"/>
+          <w:i w:val="0"/>
+          <w:sz w:val="21"/>
+        </w:rPr>
+        <w:t xml:space="preserve">, now well below the observed </w:t>
+      </w:r>
+      <w:r>
+        <w:rPr>
+          <w:rFonts w:ascii="Times New Roman" w:hAnsi="Times New Roman" w:eastAsia="宋体"/>
+          <w:b w:val="0"/>
+          <w:i w:val="0"/>
+          <w:sz w:val="21"/>
+        </w:rPr>
+        <w:t>0.0427</w:t>
+      </w:r>
+      <w:r>
+        <w:rPr>
+          <w:rFonts w:ascii="Times New Roman" w:hAnsi="Times New Roman" w:eastAsia="宋体"/>
+          <w:b w:val="0"/>
+          <w:i w:val="0"/>
+          <w:sz w:val="21"/>
+        </w:rPr>
+        <w:t>, although Brier score and maximum calibration error both improve slightly. The correction assumes the model was fitted at a prevalence of exactly 0.5; that assumption holds for the penalised linear fit but only approximately for the tree ensemble.</w:t>
+      </w:r>
+    </w:p>
+    <w:p>
+      <w:pPr>
+        <w:spacing w:after="140" w:before="0" w:line="312" w:lineRule="auto"/>
+      </w:pPr>
+      <w:r>
+        <w:rPr>
+          <w:rFonts w:ascii="Times New Roman" w:hAnsi="Times New Roman" w:eastAsia="宋体"/>
+          <w:b/>
+          <w:i w:val="0"/>
+          <w:sz w:val="21"/>
+        </w:rPr>
+        <w:t>Brier skill scores remain at or below zero after correction</w:t>
+      </w:r>
+      <w:r>
+        <w:rPr>
+          <w:rFonts w:ascii="Times New Roman" w:hAnsi="Times New Roman" w:eastAsia="宋体"/>
+          <w:b w:val="0"/>
+          <w:i w:val="0"/>
+          <w:sz w:val="21"/>
+        </w:rPr>
+        <w:t xml:space="preserve"> for both models. Their probabilities are therefore no better than always quoting the base rate under a squared-error loss, even though their discrimination (ROC-AUC </w:t>
+      </w:r>
+      <w:r>
+        <w:rPr>
+          <w:rFonts w:ascii="Times New Roman" w:hAnsi="Times New Roman" w:eastAsia="宋体"/>
+          <w:b w:val="0"/>
+          <w:i w:val="0"/>
+          <w:sz w:val="21"/>
+        </w:rPr>
+        <w:t>0.668</w:t>
+      </w:r>
+      <w:r>
+        <w:rPr>
+          <w:rFonts w:ascii="Times New Roman" w:hAnsi="Times New Roman" w:eastAsia="宋体"/>
+          <w:b w:val="0"/>
+          <w:i w:val="0"/>
+          <w:sz w:val="21"/>
+        </w:rPr>
+        <w:t>) is real. This is a concrete illustration of the distinction between discrimination and calibration: the model is useful for ranking and triage, but not for stating probabilities.</w:t>
+      </w:r>
+    </w:p>
+    <w:p>
+      <w:pPr>
+        <w:spacing w:after="80"/>
+        <w:jc w:val="center"/>
+      </w:pPr>
+      <w:r>
+        <w:drawing>
+          <wp:inline xmlns:a="http://schemas.openxmlformats.org/drawingml/2006/main" xmlns:pic="http://schemas.openxmlformats.org/drawingml/2006/picture">
+            <wp:extent cx="5760720" cy="3427866"/>
+            <wp:docPr id="5" name="Picture 5"/>
+            <wp:cNvGraphicFramePr>
+              <a:graphicFrameLocks noChangeAspect="1"/>
+            </wp:cNvGraphicFramePr>
+            <a:graphic>
+              <a:graphicData uri="http://schemas.openxmlformats.org/drawingml/2006/picture">
+                <pic:pic>
+                  <pic:nvPicPr>
+                    <pic:cNvPr id="0" name="reliability_lr.png"/>
+                    <pic:cNvPicPr/>
+                  </pic:nvPicPr>
+                  <pic:blipFill>
+                    <a:blip r:embed="rId13"/>
+                    <a:stretch>
+                      <a:fillRect/>
+                    </a:stretch>
+                  </pic:blipFill>
+                  <pic:spPr>
+                    <a:xfrm>
+                      <a:off x="0" y="0"/>
+                      <a:ext cx="5760720" cy="3427866"/>
+                    </a:xfrm>
+                    <a:prstGeom prst="rect"/>
+                  </pic:spPr>
+                </pic:pic>
+              </a:graphicData>
+            </a:graphic>
+          </wp:inline>
+        </w:drawing>
+      </w:r>
+    </w:p>
+    <w:p>
+      <w:pPr>
+        <w:spacing w:after="240" w:before="0" w:line="312" w:lineRule="auto"/>
+        <w:jc w:val="center"/>
+      </w:pPr>
+      <w:r>
+        <w:rPr>
+          <w:rFonts w:ascii="Times New Roman" w:hAnsi="Times New Roman" w:eastAsia="宋体"/>
+          <w:b w:val="0"/>
+          <w:i/>
+          <w:sz w:val="17"/>
+        </w:rPr>
+        <w:t>Figure 5. Reliability diagrams for the logistic regression, before and after prior correction. Points on the grey diagonal are perfectly calibrated. Left: the fitted model is over-confident across the whole range. Right: after a single log-odds shift the curve tracks the diagonal closely.</w:t>
+      </w:r>
+    </w:p>
+    <w:p>
+      <w:pPr>
         <w:spacing w:after="120" w:before="280" w:line="312" w:lineRule="auto"/>
       </w:pPr>
       <w:r>
@@ -4694,6 +5973,29 @@
           <w:sz w:val="21"/>
         </w:rPr>
         <w:t xml:space="preserve">  A 7.5× change in base rate across the record suggests the sequence spans distinct mining conditions. A model that appears to generalise across them under random CV may simply be memorising which regime each row belongs to.</w:t>
+      </w:r>
+    </w:p>
+    <w:p>
+      <w:pPr>
+        <w:spacing w:after="100" w:before="0" w:line="312" w:lineRule="auto"/>
+      </w:pPr>
+      <w:r>
+        <w:rPr>
+          <w:rFonts w:ascii="Times New Roman" w:hAnsi="Times New Roman" w:eastAsia="宋体"/>
+          <w:b/>
+          <w:i w:val="0"/>
+          <w:sz w:val="21"/>
+        </w:rPr>
+        <w:t>5.  Discrimination and calibration are separate properties, and only the first is usually reported.</w:t>
+      </w:r>
+      <w:r>
+        <w:rPr>
+          <w:rFonts w:ascii="Times New Roman" w:hAnsi="Times New Roman" w:eastAsia="宋体"/>
+          <w:b w:val="0"/>
+          <w:i w:val="0"/>
+          <w:sz w:val="21"/>
+        </w:rPr>
+        <w:t xml:space="preserve">  Class weighting buys discrimination on a rare-event problem at the cost of the probability scale: the logistic regression over-states risk by roughly a factor of eight until the log-odds are corrected. Since the operational use of an early-warning model is a threshold decision, the probability scale is not a detail. Reporting ROC-AUC or PR-AUC alone hides it.</w:t>
       </w:r>
     </w:p>
     <w:p>
@@ -5005,7 +6307,7 @@
       </w:r>
     </w:p>
     <w:sectPr>
-      <w:footerReference w:type="default" r:id="rId13"/>
+      <w:footerReference w:type="default" r:id="rId14"/>
       <w:pgSz w:w="12240" w:h="15840"/>
       <w:pgMar w:top="1440" w:right="1440" w:bottom="1440" w:left="1440" w:header="720" w:footer="720" w:gutter="0"/>
       <w:cols w:space="720"/>

</xml_diff>

<commit_message>
Fix metric ties and calibration handling; refresh results and reports
</commit_message>
<xml_diff>
--- a/report/technical_report.docx
+++ b/report/technical_report.docx
@@ -310,7 +310,7 @@
           <w:i w:val="0"/>
           <w:sz w:val="21"/>
         </w:rPr>
-        <w:t xml:space="preserve">Adding the record index — a pure time proxy carrying no physical information — </w:t>
+        <w:t xml:space="preserve">On a single chronological holdout (train on the first 70 % of records, test on the last 30 %), the models reach ROC-AUC 0.568–0.612. At thresholds fixed from the training period, recall is 0.154 for logistic regression and 0.231 for CART.</w:t>
       </w:r>
       <w:r>
         <w:rPr>
@@ -319,7 +319,7 @@
           <w:i/>
           <w:sz w:val="21"/>
         </w:rPr>
-        <w:t>improves</w:t>
+        <w:t/>
       </w:r>
       <w:r>
         <w:rPr>
@@ -328,7 +328,7 @@
           <w:i w:val="0"/>
           <w:sz w:val="21"/>
         </w:rPr>
-        <w:t xml:space="preserve"> random-CV scores while </w:t>
+        <w:t xml:space="preserve"/>
       </w:r>
       <w:r>
         <w:rPr>
@@ -337,7 +337,7 @@
           <w:i/>
           <w:sz w:val="21"/>
         </w:rPr>
-        <w:t>degrading</w:t>
+        <w:t/>
       </w:r>
       <w:r>
         <w:rPr>
@@ -346,7 +346,7 @@
           <w:i w:val="0"/>
           <w:sz w:val="21"/>
         </w:rPr>
-        <w:t xml:space="preserve"> time-ordered scores, which is the signature of temporal leakage. On a single chronological holdout, both models fall to ROC-AUC </w:t>
+        <w:t xml:space="preserve"/>
       </w:r>
       <w:r>
         <w:rPr>
@@ -355,7 +355,7 @@
           <w:i w:val="0"/>
           <w:sz w:val="21"/>
         </w:rPr>
-        <w:t>0.568–0.612</w:t>
+        <w:t/>
       </w:r>
       <w:r>
         <w:rPr>
@@ -364,7 +364,7 @@
           <w:i w:val="0"/>
           <w:sz w:val="21"/>
         </w:rPr>
-        <w:t xml:space="preserve"> with recall </w:t>
+        <w:t xml:space="preserve"/>
       </w:r>
       <w:r>
         <w:rPr>
@@ -373,7 +373,7 @@
           <w:i w:val="0"/>
           <w:sz w:val="21"/>
         </w:rPr>
-        <w:t>0.115</w:t>
+        <w:t/>
       </w:r>
       <w:r>
         <w:rPr>
@@ -382,7 +382,7 @@
           <w:i w:val="0"/>
           <w:sz w:val="21"/>
         </w:rPr>
-        <w:t xml:space="preserve"> at an operational threshold. Any claim about the forecasting skill of these models should therefore be based on time-respecting validation.</w:t>
+        <w:t xml:space="preserve"/>
       </w:r>
     </w:p>
     <w:p>
@@ -396,7 +396,7 @@
           <w:i w:val="0"/>
           <w:sz w:val="21"/>
         </w:rPr>
-        <w:t xml:space="preserve">A final check concerns the probability scale. Class weighting, which is needed here because positives are rare, makes the fit behave as if the base rate were 0.50. The logistic regression’s mean predicted probability is </w:t>
+        <w:t xml:space="preserve">A final check concerns the probability scale. Balanced class weights affect the logistic model's probabilities, so its prior correction is estimated from historical training data. CART is unweighted and is reported as fitted. Ranking metrics are blind to probability calibration.</w:t>
       </w:r>
       <w:r>
         <w:rPr>
@@ -405,7 +405,7 @@
           <w:i w:val="0"/>
           <w:sz w:val="21"/>
         </w:rPr>
-        <w:t>0.333</w:t>
+        <w:t/>
       </w:r>
       <w:r>
         <w:rPr>
@@ -414,7 +414,7 @@
           <w:i w:val="0"/>
           <w:sz w:val="21"/>
         </w:rPr>
-        <w:t xml:space="preserve"> against an observed rate of </w:t>
+        <w:t xml:space="preserve"/>
       </w:r>
       <w:r>
         <w:rPr>
@@ -423,7 +423,7 @@
           <w:i w:val="0"/>
           <w:sz w:val="21"/>
         </w:rPr>
-        <w:t>0.0427</w:t>
+        <w:t/>
       </w:r>
       <w:r>
         <w:rPr>
@@ -432,7 +432,7 @@
           <w:i w:val="0"/>
           <w:sz w:val="21"/>
         </w:rPr>
-        <w:t xml:space="preserve">; a single log-odds shift reduces the expected calibration error from </w:t>
+        <w:t xml:space="preserve"/>
       </w:r>
       <w:r>
         <w:rPr>
@@ -441,7 +441,7 @@
           <w:i w:val="0"/>
           <w:sz w:val="21"/>
         </w:rPr>
-        <w:t>0.290</w:t>
+        <w:t/>
       </w:r>
       <w:r>
         <w:rPr>
@@ -450,7 +450,7 @@
           <w:i w:val="0"/>
           <w:sz w:val="21"/>
         </w:rPr>
-        <w:t xml:space="preserve"> to </w:t>
+        <w:t xml:space="preserve"/>
       </w:r>
       <w:r>
         <w:rPr>
@@ -459,7 +459,7 @@
           <w:i w:val="0"/>
           <w:sz w:val="21"/>
         </w:rPr>
-        <w:t>0.0144</w:t>
+        <w:t/>
       </w:r>
       <w:r>
         <w:rPr>
@@ -468,7 +468,7 @@
           <w:i w:val="0"/>
           <w:sz w:val="21"/>
         </w:rPr>
-        <w:t>. The same correction over-corrects the tree ensemble, which is already close to calibrated. Ranking metrics are blind to all of this.</w:t>
+        <w:t/>
       </w:r>
     </w:p>
     <w:p>
@@ -1763,7 +1763,7 @@
           <w:i w:val="0"/>
           <w:sz w:val="21"/>
         </w:rPr>
-        <w:t xml:space="preserve">Accuracy alone is uninformative here: predicting “no hazard” for every record already scores </w:t>
+        <w:t xml:space="preserve">We report ROC-AUC, PR-AUC (average precision), balanced accuracy, and recall/precision at a threshold whose alert rate is fixed from historical training data (7.98 % in this run), rather than from evaluation labels.</w:t>
       </w:r>
       <w:r>
         <w:rPr>
@@ -1772,7 +1772,7 @@
           <w:i w:val="0"/>
           <w:sz w:val="21"/>
         </w:rPr>
-        <w:t>0.9341</w:t>
+        <w:t/>
       </w:r>
       <w:r>
         <w:rPr>
@@ -1781,7 +1781,7 @@
           <w:i w:val="0"/>
           <w:sz w:val="21"/>
         </w:rPr>
-        <w:t xml:space="preserve">. We therefore report ROC-AUC, PR-AUC (average precision), balanced accuracy, and recall/precision at a threshold that flags the riskiest </w:t>
+        <w:t xml:space="preserve"/>
       </w:r>
       <w:r>
         <w:rPr>
@@ -1790,7 +1790,7 @@
           <w:i w:val="0"/>
           <w:sz w:val="21"/>
         </w:rPr>
-        <w:t>6.59%</w:t>
+        <w:t/>
       </w:r>
       <w:r>
         <w:rPr>
@@ -1799,7 +1799,7 @@
           <w:i w:val="0"/>
           <w:sz w:val="21"/>
         </w:rPr>
-        <w:t xml:space="preserve"> of shifts — the operating point implied by the base rate.</w:t>
+        <w:t xml:space="preserve"/>
       </w:r>
     </w:p>
     <w:p>
@@ -2085,7 +2085,7 @@
                 <w:i w:val="0"/>
                 <w:sz w:val="17"/>
               </w:rPr>
-              <w:t>0.904</w:t>
+              <w:t>0.896</w:t>
             </w:r>
           </w:p>
         </w:tc>
@@ -2105,7 +2105,7 @@
                 <w:i w:val="0"/>
                 <w:sz w:val="17"/>
               </w:rPr>
-              <w:t>0.610</w:t>
+              <w:t>0.627</w:t>
             </w:r>
           </w:p>
         </w:tc>
@@ -2125,7 +2125,7 @@
                 <w:i w:val="0"/>
                 <w:sz w:val="17"/>
               </w:rPr>
-              <w:t>0.271</w:t>
+              <w:t>0.318</w:t>
             </w:r>
           </w:p>
         </w:tc>
@@ -2227,7 +2227,7 @@
                 <w:i w:val="0"/>
                 <w:sz w:val="17"/>
               </w:rPr>
-              <w:t>0.927</w:t>
+              <w:t>0.895</w:t>
             </w:r>
           </w:p>
         </w:tc>
@@ -2247,7 +2247,7 @@
                 <w:i w:val="0"/>
                 <w:sz w:val="17"/>
               </w:rPr>
-              <w:t>0.555</w:t>
+              <w:t>0.565</w:t>
             </w:r>
           </w:p>
         </w:tc>
@@ -2267,7 +2267,7 @@
                 <w:i w:val="0"/>
                 <w:sz w:val="17"/>
               </w:rPr>
-              <w:t>0.148</w:t>
+              <w:t>0.205</w:t>
             </w:r>
           </w:p>
         </w:tc>
@@ -2369,7 +2369,7 @@
                 <w:i w:val="0"/>
                 <w:sz w:val="17"/>
               </w:rPr>
-              <w:t>0.902</w:t>
+              <w:t>0.894</w:t>
             </w:r>
           </w:p>
         </w:tc>
@@ -2389,7 +2389,7 @@
                 <w:i w:val="0"/>
                 <w:sz w:val="17"/>
               </w:rPr>
-              <w:t>0.603</w:t>
+              <w:t>0.621</w:t>
             </w:r>
           </w:p>
         </w:tc>
@@ -2409,7 +2409,7 @@
                 <w:i w:val="0"/>
                 <w:sz w:val="17"/>
               </w:rPr>
-              <w:t>0.259</w:t>
+              <w:t>0.306</w:t>
             </w:r>
           </w:p>
         </w:tc>
@@ -2511,7 +2511,7 @@
                 <w:i w:val="0"/>
                 <w:sz w:val="17"/>
               </w:rPr>
-              <w:t>0.924</w:t>
+              <w:t>0.895</w:t>
             </w:r>
           </w:p>
         </w:tc>
@@ -2531,7 +2531,7 @@
                 <w:i w:val="0"/>
                 <w:sz w:val="17"/>
               </w:rPr>
-              <w:t>0.537</w:t>
+              <w:t>0.565</w:t>
             </w:r>
           </w:p>
         </w:tc>
@@ -2551,7 +2551,7 @@
                 <w:i w:val="0"/>
                 <w:sz w:val="17"/>
               </w:rPr>
-              <w:t>0.114</w:t>
+              <w:t>0.205</w:t>
             </w:r>
           </w:p>
         </w:tc>
@@ -3664,7 +3664,7 @@
                 <w:i w:val="0"/>
                 <w:sz w:val="17"/>
               </w:rPr>
-              <w:t>0.941</w:t>
+              <w:t>0.897</w:t>
             </w:r>
           </w:p>
         </w:tc>
@@ -3684,7 +3684,7 @@
                 <w:i w:val="0"/>
                 <w:sz w:val="17"/>
               </w:rPr>
-              <w:t>0.115</w:t>
+              <w:t>0.154</w:t>
             </w:r>
           </w:p>
         </w:tc>
@@ -3704,7 +3704,7 @@
                 <w:i w:val="0"/>
                 <w:sz w:val="17"/>
               </w:rPr>
-              <w:t>0.115</w:t>
+              <w:t>0.065</w:t>
             </w:r>
           </w:p>
         </w:tc>
@@ -3806,7 +3806,7 @@
                 <w:i w:val="0"/>
                 <w:sz w:val="17"/>
               </w:rPr>
-              <w:t>0.941</w:t>
+              <w:t>0.902</w:t>
             </w:r>
           </w:p>
         </w:tc>
@@ -3826,7 +3826,7 @@
                 <w:i w:val="0"/>
                 <w:sz w:val="17"/>
               </w:rPr>
-              <w:t>0.115</w:t>
+              <w:t>0.231</w:t>
             </w:r>
           </w:p>
         </w:tc>
@@ -3846,7 +3846,7 @@
                 <w:i w:val="0"/>
                 <w:sz w:val="17"/>
               </w:rPr>
-              <w:t>0.115</w:t>
+              <w:t>0.097</w:t>
             </w:r>
           </w:p>
         </w:tc>
@@ -4701,7 +4701,7 @@
           <w:i w:val="0"/>
           <w:sz w:val="21"/>
         </w:rPr>
-        <w:t>Class weights are what make these models usable on a 6.6 %-positive dataset, but they have a side effect: the fit behaves as if the base rate were 0.50, so the output probabilities sit on the wrong scale. Ranking metrics are blind to this, because they depend only on the order of the scores. For an early-warning system, however, the difference between “8 % chance” and “33 % chance” is the difference between a usable threshold rule and a useless one.</w:t>
+        <w:t>Balanced class weights affect the logistic model's probability scale, while CART is unweighted. The logistic output receives a prior correction estimated from historical training data; CART is reported as fitted.</w:t>
       </w:r>
     </w:p>
     <w:tbl>
@@ -5102,7 +5102,7 @@
                 <w:i w:val="0"/>
                 <w:sz w:val="17"/>
               </w:rPr>
-              <w:t>0.0414</w:t>
+              <w:t>0.0418</w:t>
             </w:r>
           </w:p>
         </w:tc>
@@ -5122,7 +5122,7 @@
                 <w:i w:val="0"/>
                 <w:sz w:val="17"/>
               </w:rPr>
-              <w:t>-0.013</w:t>
+              <w:t>-0.0233</w:t>
             </w:r>
           </w:p>
         </w:tc>
@@ -5142,7 +5142,7 @@
                 <w:i w:val="0"/>
                 <w:sz w:val="17"/>
               </w:rPr>
-              <w:t>0.0144</w:t>
+              <w:t>0.0181</w:t>
             </w:r>
           </w:p>
         </w:tc>
@@ -5162,7 +5162,7 @@
                 <w:i w:val="0"/>
                 <w:sz w:val="17"/>
               </w:rPr>
-              <w:t>0.0413</w:t>
+              <w:t>0.0669</w:t>
             </w:r>
           </w:p>
         </w:tc>
@@ -5182,7 +5182,7 @@
                 <w:i w:val="0"/>
                 <w:sz w:val="17"/>
               </w:rPr>
-              <w:t>0.0436</w:t>
+              <w:t>0.0524</w:t>
             </w:r>
           </w:p>
         </w:tc>
@@ -5244,7 +5244,7 @@
                 <w:i w:val="0"/>
                 <w:sz w:val="17"/>
               </w:rPr>
-              <w:t>as fitted (class-weighted)</w:t>
+              <w:t>as fitted (unweighted)</w:t>
             </w:r>
           </w:p>
         </w:tc>
@@ -5284,7 +5284,7 @@
                 <w:i w:val="0"/>
                 <w:sz w:val="17"/>
               </w:rPr>
-              <w:t>-0.061</w:t>
+              <w:t>-0.0607</w:t>
             </w:r>
           </w:p>
         </w:tc>
@@ -5406,7 +5406,7 @@
                 <w:i w:val="0"/>
                 <w:sz w:val="17"/>
               </w:rPr>
-              <w:t>after prior correction</w:t>
+              <w:t>not applicable (unweighted)</w:t>
             </w:r>
           </w:p>
         </w:tc>
@@ -5426,7 +5426,7 @@
                 <w:i w:val="0"/>
                 <w:sz w:val="17"/>
               </w:rPr>
-              <w:t>0.0420</w:t>
+              <w:t>-</w:t>
             </w:r>
           </w:p>
         </w:tc>
@@ -5446,7 +5446,7 @@
                 <w:i w:val="0"/>
                 <w:sz w:val="17"/>
               </w:rPr>
-              <w:t>-0.028</w:t>
+              <w:t>-</w:t>
             </w:r>
           </w:p>
         </w:tc>
@@ -5466,7 +5466,7 @@
                 <w:i w:val="0"/>
                 <w:sz w:val="17"/>
               </w:rPr>
-              <w:t>0.0372</w:t>
+              <w:t>-</w:t>
             </w:r>
           </w:p>
         </w:tc>
@@ -5486,7 +5486,7 @@
                 <w:i w:val="0"/>
                 <w:sz w:val="17"/>
               </w:rPr>
-              <w:t>0.0935</w:t>
+              <w:t>-</w:t>
             </w:r>
           </w:p>
         </w:tc>
@@ -5506,7 +5506,7 @@
                 <w:i w:val="0"/>
                 <w:sz w:val="17"/>
               </w:rPr>
-              <w:t>0.0055</w:t>
+              <w:t>-</w:t>
             </w:r>
           </w:p>
         </w:tc>
@@ -5698,7 +5698,7 @@
           <w:i w:val="0"/>
           <w:sz w:val="21"/>
         </w:rPr>
-        <w:t xml:space="preserve">The bagged CART ensemble is far better calibrated even before correction (mean predicted </w:t>
+        <w:t xml:space="preserve">The correction is applied only to the balanced logistic fit. CART has no class weighting and is not prior-corrected.</w:t>
       </w:r>
       <w:r>
         <w:rPr>
@@ -5707,7 +5707,7 @@
           <w:i w:val="0"/>
           <w:sz w:val="21"/>
         </w:rPr>
-        <w:t>0.0662</w:t>
+        <w:t/>
       </w:r>
       <w:r>
         <w:rPr>
@@ -5716,7 +5716,7 @@
           <w:i w:val="0"/>
           <w:sz w:val="21"/>
         </w:rPr>
-        <w:t xml:space="preserve">), because averaging leaf proportions over bootstrap samples already pulls the probabilities back towards the empirical rate. Here the same correction </w:t>
+        <w:t xml:space="preserve"/>
       </w:r>
       <w:r>
         <w:rPr>
@@ -5725,7 +5725,7 @@
           <w:i/>
           <w:sz w:val="21"/>
         </w:rPr>
-        <w:t>over-corrects</w:t>
+        <w:t/>
       </w:r>
       <w:r>
         <w:rPr>
@@ -5734,7 +5734,7 @@
           <w:i w:val="0"/>
           <w:sz w:val="21"/>
         </w:rPr>
-        <w:t xml:space="preserve">: the mean prediction falls to </w:t>
+        <w:t xml:space="preserve"/>
       </w:r>
       <w:r>
         <w:rPr>
@@ -5743,7 +5743,7 @@
           <w:i w:val="0"/>
           <w:sz w:val="21"/>
         </w:rPr>
-        <w:t>0.0055</w:t>
+        <w:t/>
       </w:r>
       <w:r>
         <w:rPr>
@@ -5752,7 +5752,7 @@
           <w:i w:val="0"/>
           <w:sz w:val="21"/>
         </w:rPr>
-        <w:t xml:space="preserve">, now well below the observed </w:t>
+        <w:t xml:space="preserve"/>
       </w:r>
       <w:r>
         <w:rPr>
@@ -5761,7 +5761,7 @@
           <w:i w:val="0"/>
           <w:sz w:val="21"/>
         </w:rPr>
-        <w:t>0.0427</w:t>
+        <w:t/>
       </w:r>
       <w:r>
         <w:rPr>
@@ -5770,7 +5770,7 @@
           <w:i w:val="0"/>
           <w:sz w:val="21"/>
         </w:rPr>
-        <w:t>, although Brier score and maximum calibration error both improve slightly. The correction assumes the model was fitted at a prevalence of exactly 0.5; that assumption holds for the penalised linear fit but only approximately for the tree ensemble.</w:t>
+        <w:t/>
       </w:r>
     </w:p>
     <w:p>

</xml_diff>

<commit_message>
Polish paper narrative around cohort matching and mine warning decisions
</commit_message>
<xml_diff>
--- a/report/technical_report.docx
+++ b/report/technical_report.docx
@@ -7,7 +7,7 @@
         <w:pStyle w:val="Title"/>
       </w:pPr>
       <w:r>
-        <w:t>When the validation gap shrinks: test-cohort composition, warning thresholds and calibration in seismic bump forecasting</w:t>
+        <w:t>Cohort matched evaluation of seismic bump forecasting for mine warning decisions</w:t>
       </w:r>
     </w:p>
     <w:p>
@@ -53,11 +53,8 @@
       </w:r>
     </w:p>
     <w:p>
-      <w:pPr>
-        <w:jc w:val="both"/>
-      </w:pPr>
       <w:r>
-        <w:t>Most of the apparent random-versus-record-order performance gap in this study disappears when the same test records are evaluated. On a 2,578-row mirror of the UCI Seismic Bumps dataset, restricting random out-of-fold scores to the 2,063 records covered by record-order validation reduces the absolute PR-AUC gap by 89.7 percent for logistic regression (LR) and 86.9 percent for bagged CART. The remaining differences are 0.0114 and 0.0188; phase-stratified paired moving-block bootstrap 95 percent intervals are [-0.0110, 0.0243] and [0.0064, 0.0323], respectively. These are conditional uncertainty estimates for fixed predictions, and the gap reduction is a descriptive cohort sensitivity result rather than a causal decomposition of leakage. Operational performance remains weak: LR detects only 2 of 26 hazardous holdout shifts at its training-derived threshold. Fold-local prior correction reduces LR expected calibration error from 0.2904 to 0.0271 and Brier score from 0.1462 to 0.0439, but corrected forecasts still have negative Brier skill against a retrospective constant baseline. The contribution is a reproducible engineering evaluation that distinguishes ranking, probability calibration and warning-policy transfer before considering field deployment.</w:t>
+        <w:t>Seismic warning evaluation must distinguish changes in the test population from changes in model behavior. We present an evaluation workflow that matches test records across validation protocols and connects discrimination, probability calibration and warning counts. On a 2,578-row mirror of the UCI Seismic Bumps dataset, evaluating both protocols on the same 2,063 records reduces the random-versus-record-order PR-AUC gap by 89.7 percent for logistic regression (LR) and 86.9 percent for bagged CART. The residual differences are 0.0114 and 0.0188, with paired moving-block bootstrap 95 percent intervals of [-0.0110, 0.0243] and [0.0064, 0.0323]. Training-fold prior correction reduces LR expected calibration error from 0.2904 to 0.0271 and Brier score from 0.1462 to 0.0439. A holdout evaluation then translates the fixed LR threshold into 8 alerts, 2 detected hazardous shifts and 24 missed hazardous shifts among 774 records. Together, these results establish test-cohort comparability as a prerequisite for interpreting validation gaps and show how calibration and threshold transfer require separate assessment. The gap reduction describes sensitivity to cohort composition; the intervals condition on fixed predictions. The workflow provides traceable evidence for evaluating mine-warning policies before prospective trials.</w:t>
       </w:r>
     </w:p>
     <w:p>
@@ -81,17 +78,17 @@
     </w:p>
     <w:p>
       <w:r>
-        <w:t>A useful mine-warning model must identify hazardous shifts early enough to support a defined operational response. A high accuracy score alone is insufficient when hazardous events are rare: always predicting the negative class achieves 93.41 percent accuracy in this mirror. The UCI target records whether an event above 10^4 J occurs in the next shift; it is a proxy for elevated seismic activity, not a direct rockburst or injury label [1]. This distinction matters because the consequences of a missed warning and the costs of repeated inspections are operational quantities, not properties of an AUC metric.</w:t>
+        <w:t>A mine-warning forecast has value when it supports a timely monitoring or inspection decision. For rare seismic hazards, evaluation must connect a model score to the hazardous shifts it detects and the workload its alerts create. The UCI Seismic Bumps target records an event above 10^4 J in the following shift [1]. This provides a concrete setting for studying early-warning evaluation: hazardous shifts comprise a small fraction of the records, and an always-negative predictor already achieves 93.41 percent accuracy.</w:t>
       </w:r>
     </w:p>
     <w:p>
       <w:r>
-        <w:t>Evaluation must therefore answer three different questions: whether higher scores rank hazardous shifts above safe shifts, whether a score can be interpreted as a probability, and whether a numerical warning threshold continues to work in a later period. Temporal or spatial structure can invalidate a simple random-split interpretation [3,4]. Yet a protocol comparison also changes which records are tested and how much training history is available. This paper tests the sensitivity of the apparent validation gap to a common test cohort, estimates the remaining paired difference, and examines calibration and warning thresholds as separate engineering outcomes.</w:t>
+        <w:t>Validation protocols are central to this assessment. Random splitting and validation along a record sequence admit different training histories [3,4], but they can also evaluate different test populations. A large PR-AUC gap may consequently reflect changes in which shifts are scored alongside changes in prediction behavior. Comparing the protocols on a common cohort makes this overlooked source of variation directly measurable.</w:t>
       </w:r>
     </w:p>
     <w:p>
       <w:r>
-        <w:t>This study uses tabular monitoring data and two interpretable baseline model families. Its image-data relevance concerns evaluation design: audit provenance, keep related observations together, prevent test information entering model decisions, and report operational consequences. Section 5.3 develops this transfer.</w:t>
+        <w:t>We organize the analysis around this common test cohort and extend it to the decisions a warning model must support. The comparison measures how much of the apparent protocol gap changes when the test rows are matched; paired block resampling quantifies the residual difference. Training-fold prior correction then assesses the probability scale, while a fixed-threshold holdout expresses performance as detected events, missed events and alerts. The resulting contribution is an auditable evaluation workflow that links mine-monitoring records to warning consequences. Section 5.3 develops its transfer to UAV and mine-image validation.</w:t>
       </w:r>
     </w:p>
     <w:p>
@@ -729,7 +726,7 @@
     </w:p>
     <w:p>
       <w:r>
-        <w:t>Identical measurements may arise in distinct shifts, so this audit confirms the mirror transformation rather than establishing that the removed records were invalid. Removing six negatives slightly changes prevalence and index spacing; results should not be compared as if they were evaluations of all 2,584 original records. The order-preserving transformation also does not prove that the original file is a single chronological sequence. Explicit timestamps and longwall identifiers are absent.</w:t>
+        <w:t>The analysis uses this audited mirror throughout. Its version is reported explicitly so that comparisons can distinguish the 2,578-row cohort from published evaluations of the 2,584-row original. Row order serves as the temporal proxy; the file supplies no explicit timestamps or longwall identifiers.</w:t>
       </w:r>
     </w:p>
     <w:p>
@@ -742,7 +739,7 @@
     </w:p>
     <w:p>
       <w:r>
-        <w:t>Each record summarizes one eight-hour shift. Predictor groups include mine hazard assessments, geophone energy and pulse measures, deviations from preceding-shift reference levels, bump counts by energy range, and total or maximum bump energy [1]. The target refers to the following shift. This measurement-to-target timing is essential when reconstructing a field prediction task. Ordinal categorical encoding and removal of total nbumps leave 17 input columns. Three retained bump-count columns are constant; regularized LR and constant-safe scaling allow fitting without claiming full matrix rank.</w:t>
+        <w:t>Each record summarizes one eight-hour shift. Predictor groups include mine hazard assessments, geophone energy and pulse measures, deviations from preceding-shift reference levels, bump counts by energy range, and total or maximum bump energy [1]. The target refers to the following shift. This measurement-to-target timing is essential when reconstructing a field prediction task. Ordinal categorical encoding and removal of total nbumps leave 17 input columns. Three retained bump-count columns are constant; constant-safe scaling and L2 regularization accommodate the resulting rank deficiency.</w:t>
       </w:r>
     </w:p>
     <w:p>
@@ -817,7 +814,7 @@
     </w:p>
     <w:p>
       <w:r>
-        <w:t>LR uses IRLS, L2 penalty 1.0, an unpenalized intercept and balanced class weights. Scaling is fitted on training rows only. The tree baseline uses 60 ordinary bootstrap CART trees, depth 6 and at least 20 observations per leaf, with unweighted Gini impurity and unweighted leaf probabilities. No hyperparameter search is conducted. These baselines assess evaluation behavior rather than seek a state-of-the-art score.</w:t>
+        <w:t>LR uses IRLS, L2 penalty 1.0, an unpenalized intercept and balanced class weights. Scaling is fitted on training rows only. The tree baseline uses 60 ordinary bootstrap CART trees, depth 6 and at least 20 observations per leaf, with unweighted Gini impurity and unweighted leaf probabilities. Hyperparameters are fixed across protocols, providing a controlled comparison of evaluation behavior for linear and nonlinear predictors.</w:t>
       </w:r>
     </w:p>
     <w:p>
@@ -835,12 +832,12 @@
     </w:p>
     <w:p>
       <w:r>
-        <w:t>Random predictions for each seed are restricted to the exact 2,063 rows covered by record-order validation. The reported difference is the mean random average precision across five seeds minus the temporal average precision. This averages metrics, not probabilities. Seeds quantify split sensitivity and are not treated as five independent samples from the mine population.</w:t>
+        <w:t>Random predictions for each seed are restricted to the exact 2,063 rows covered by record-order validation. The reported difference is the mean random average precision across five seeds minus the temporal average precision. The aggregation averages seed-specific metrics. Seeds describe sensitivity to fold assignment rather than independent sampling of mine populations.</w:t>
       </w:r>
     </w:p>
     <w:p>
       <w:r>
-        <w:t>The primary interval uses 2,000 paired moving-block bootstrap replicates, block length 32 records and fixed random generator seed 20261002. For every replicate, contiguous blocks are sampled with replacement separately within each of the four temporal test phases, preserving each phase size; the final block is truncated. The identical sampled row indices are applied to labels, all five random prediction vectors and the temporal vector. The statistic is recomputed on each resampled cohort, and its 2.5th and 97.5th percentiles form a conditional interval. Block lengths 16 and 64, plus phase-stratified paired IID resampling, are sensitivity checks. Blocks preserve some local dependence [5] but cannot recover missing timestamps or guarantee correct coverage under nonstationary mine conditions. No models are refitted during resampling; training-set and model-fit uncertainty are excluded.</w:t>
+        <w:t>The primary interval uses 2,000 paired moving-block bootstrap replicates, block length 32 records and fixed random generator seed 20261002. For every replicate, contiguous blocks are sampled with replacement separately within each of the four temporal test phases, preserving each phase size; the final block is truncated. The identical sampled row indices are applied to labels, all five random prediction vectors and the temporal vector. The statistic is recomputed on each resampled cohort, and its 2.5th and 97.5th percentiles form a conditional interval. Block lengths 16 and 64, plus phase-stratified paired IID resampling, are sensitivity checks. Resampling contiguous records preserves local dependence within blocks [5]. Models remain fixed during resampling, so the intervals describe test-cohort uncertainty conditional on the saved predictions. Section 5.2 sets out the scope of this analysis.</w:t>
       </w:r>
     </w:p>
     <w:p>
@@ -853,17 +850,17 @@
     </w:p>
     <w:p>
       <w:r>
-        <w:t>Each outer training fold has an inner split: temporal folds reserve the latest 20 percent of training rows, while random folds reserve 20 percent within each class. An inner model scores these reference rows; its own training prevalence sets a reference alert budget. The boundary score and all its ties are excluded together so the reference count cannot exceed the integer budget. The outer model is refitted on its full training fold and evaluated using that fixed numerical threshold. Neither test labels nor test score quantiles select the threshold. The budget is a training-reference ranking heuristic, not a cost-optimal mine warning policy or an enforced percentage of future alerts.</w:t>
+        <w:t>Each outer training fold has an inner split: temporal folds reserve the latest 20 percent of training rows, while random folds reserve 20 percent within each class. An inner model scores these reference rows; its own training prevalence sets a reference alert budget. The boundary score and all its ties are excluded together so the reference count cannot exceed the integer budget. The outer model is refitted on its full training fold and evaluated using that fixed numerical threshold. Threshold selection is completed within training; the realized test alert rate is then measured as an outcome. The prevalence-based budget defines a reference operating point for studying threshold transfer.</w:t>
       </w:r>
     </w:p>
     <w:p>
       <w:r>
-        <w:t>For balanced-weight LR, a log-odds offset converts the effective training prior of 0.5 to each outer training fold's unweighted positive proportion. The transformation is applied fold by fold before pooling calibration predictions. CART is unweighted and receives no such correction. A correction with one fixed prior is monotone and preserves rankings within that fold; different corrections across folds can change the pooled ordering. The discrimination tables use raw scores, so improved calibration is not presented as improved discrimination.</w:t>
+        <w:t>For balanced-weight LR, a log-odds offset converts the effective training prior of 0.5 to each outer training fold's unweighted positive proportion. The transformation is applied fold by fold before pooling calibration predictions. CART is unweighted and receives no such correction. A correction with one fixed prior is monotone and preserves rankings within that fold; different corrections across folds can change the pooled ordering. The discrimination tables retain raw scores, separating the assessment of probability scale from the assessment of ranking.</w:t>
       </w:r>
     </w:p>
     <w:p>
       <w:r>
-        <w:t>Calibration uses Brier score, expected calibration error (ECE), maximum calibration error and reliability diagrams. Ten quantile bins are requested; repeated edges are merged and tied scores remain together. ECE depends on the binning choice and is not by itself proof of calibrated individual probabilities. Brier skill is reported against an evaluation-prevalence constant predictor, explicitly a retrospective oracle reference rather than a deployable training baseline.</w:t>
+        <w:t>Calibration uses Brier score, expected calibration error (ECE), maximum calibration error and reliability diagrams. Ten quantile bins are requested; repeated edges are merged and tied scores remain together. Reliability diagrams and Brier error complement the bin-dependent ECE. Brier skill uses an evaluation-prevalence constant predictor as a retrospective oracle reference.</w:t>
       </w:r>
     </w:p>
     <w:p>
@@ -879,12 +876,12 @@
         <w:pStyle w:val="Heading2"/>
       </w:pPr>
       <w:r>
-        <w:t>4.1 Most of the apparent gap is sensitive to test-cohort composition</w:t>
+        <w:t>4.1 Test cohort matching reduces the apparent validation gap</w:t>
       </w:r>
     </w:p>
     <w:p>
       <w:r>
-        <w:t>Table 2 retains the original different-cohort comparison alongside the common-cohort result. The absolute gap shrinks by 89.7 percent for LR and 86.9 percent for CART when the early training-only records are removed from random evaluation. The fitted random models are unchanged in this restriction; the evaluation population changes. This establishes a large sensitivity to test composition, including prevalence and record difficulty. It does not assign the reduction to prevalence alone or estimate the share caused by leakage.</w:t>
+        <w:t>Matching the test records reduces the absolute PR-AUC gap by 89.7 percent for LR and 86.9 percent for CART (Table 2). The random-model fits and predictions remain unchanged; their evaluation is restricted to the rows covered by record-order validation. The large reduction therefore demonstrates how strongly the apparent protocol gap depends on test composition, including prevalence and record difficulty.</w:t>
       </w:r>
     </w:p>
     <w:p>
@@ -1689,12 +1686,12 @@
     </w:p>
     <w:p>
       <w:r>
-        <w:t>Across the five random fold assignments, the common-cohort AP difference ranges from 0.0088 to 0.0128 for LR and from 0.0169 to 0.0223 for CART. These ranges describe split sensitivity, not confidence intervals or independent mine replications.</w:t>
+        <w:t>Across the five random fold assignments, the common-cohort AP difference ranges from 0.0088 to 0.0128 for LR and from 0.0169 to 0.0223 for CART. These ranges summarize split sensitivity alongside the paired test-cohort intervals.</w:t>
       </w:r>
     </w:p>
     <w:p>
       <w:r>
-        <w:t>Figure 2 shows the primary intervals and block-length sensitivity. The LR interval crosses zero; the CART interval remains above zero across the examined block lengths. The two models therefore do not support the same residual-gap statement. Inclusion of zero means that this conditional resampling analysis does not clearly distinguish a residual difference from zero; it does not establish equivalence. Exclusion of zero would indicate a difference under these resampling assumptions, not prove its cause. Training sizes, allowed training periods and pooled score scales remain different.</w:t>
+        <w:t>The paired analysis distinguishes the residual behavior of the two model families (Figure 2). The LR interval spans zero, while the CART interval stays positive across the examined block lengths. The common cohort thus reveals a smaller and model-dependent protocol difference that the original pooled comparison obscured. An interval spanning zero leaves a range of residual differences compatible with the resampling analysis; it is not an equivalence test. The gap reduction measures cohort sensitivity, while remaining differences in training history and size preclude a causal leakage decomposition.</w:t>
       </w:r>
     </w:p>
     <w:p>
@@ -1797,7 +1794,7 @@
     </w:p>
     <w:p>
       <w:r>
-        <w:t>Figure 3 compares the same evaluation cohort for both protocols. Its common positive proportion, 0.0427, is the prevalence reference for interpreting average precision. The plot is a visualization of one random seed, not a substitute for the seed means or uncertainty analysis.</w:t>
+        <w:t>Figure 3 visualizes the common-cohort comparison at random seed 0. The shared positive proportion of 0.0427 supplies a consistent prevalence reference for interpreting both precision-recall curves; Table 3 and Figure 2 provide the aggregate estimates and their uncertainty.</w:t>
       </w:r>
     </w:p>
     <w:p>
@@ -1805,12 +1802,12 @@
         <w:pStyle w:val="Heading2"/>
       </w:pPr>
       <w:r>
-        <w:t>4.2 Calibration improves, but remains insufficient for deployment</w:t>
+        <w:t>4.2 Training priors improve probability calibration</w:t>
       </w:r>
     </w:p>
     <w:p>
       <w:r>
-        <w:t>Fold-local LR prior correction reduces ECE from 0.2904 to 0.0271 and Brier score from 0.1462 to 0.0439 (Table 4). Mean predicted probability falls from 0.3331 to 0.0694 against observed prevalence 0.0427. This is a substantial empirical improvement in probability scale, despite the remaining overprediction. Corrected LR Brier skill is -0.0751 and unweighted CART Brier skill is -0.0607 against the oracle constant reference, so neither outperforms that reference in squared probability error.</w:t>
+        <w:t>Fold-local LR prior correction reduces ECE from 0.2904 to 0.0271 and Brier score from 0.1462 to 0.0439 (Table 4). Mean predicted probability falls from 0.3331 to 0.0694 against observed prevalence 0.0427. The correction brings the probability scale substantially closer to the observed event frequency using historical labels available to each training fold. Against the retrospective constant reference, corrected LR Brier skill is -0.0751 and unweighted CART Brier skill is -0.0607. These benchmark values quantify the remaining probability error alongside the improvement from the weighted LR output.</w:t>
       </w:r>
     </w:p>
     <w:p>
@@ -2439,7 +2436,7 @@
     </w:p>
     <w:p>
       <w:r>
-        <w:t>The bin summaries in calibration_bins.csv conserve all test observations. Apparent scarcity of points near zero can reflect overlapping bins at the plotted scale rather than omitted samples. Improved ECE should be interpreted together with Brier skill and the observed-versus-predicted mean, rather than as a deployment certificate.</w:t>
+        <w:t>The reliability diagrams show how the training-prior correction redistributes forecasts toward the low-risk range (Figure 4). Each panel contains all 2,063 observations, with closely spaced low-probability bins appearing near the origin. Brier skill and the forecast-to-observation mean comparison retain a complementary assessment of the remaining probability error.</w:t>
       </w:r>
     </w:p>
     <w:p>
@@ -2447,12 +2444,15 @@
         <w:pStyle w:val="Heading2"/>
       </w:pPr>
       <w:r>
-        <w:t>4.3 A training-derived threshold can produce very few future alerts</w:t>
+        <w:t>4.3 Warning counts expose threshold transfer behavior</w:t>
       </w:r>
     </w:p>
     <w:p>
+      <w:pPr>
+        <w:keepLines/>
+      </w:pPr>
       <w:r>
-        <w:t>Table 5 reports fixed-threshold holdout performance. For LR, 8 of 774 shifts are flagged, including 2 true positives and 6 false positives; 24 of 26 hazardous shifts are missed. Recall is 0.0769 and the alert rate is 0.0103. CART is also weak at this operating point. These counts are the relevant warning consequences hidden by the high overall accuracy.</w:t>
+        <w:t>Table 5 reports fixed-threshold holdout performance. For LR, 8 of 774 shifts are flagged, including 2 true positives and 6 false positives; 24 of 26 hazardous shifts are missed. Recall is 0.0769 and the alert rate is 0.0103. These counts translate the selected operating point into event detection and review workload, which overall accuracy does not resolve.</w:t>
       </w:r>
     </w:p>
     <w:p>
@@ -2461,7 +2461,7 @@
         <w:keepNext/>
       </w:pPr>
       <w:r>
-        <w:t>Table 5. Chronological holdout warning outcomes, using frozen numerical thresholds selected inside training.</w:t>
+        <w:t>Table 5. Record-order holdout warning outcomes, using frozen numerical thresholds selected inside training.</w:t>
       </w:r>
     </w:p>
     <w:tbl>
@@ -2977,7 +2977,7 @@
     </w:p>
     <w:p>
       <w:r>
-        <w:t>The nominal budget belongs to the historical inner-reference data; it is not imposed on the holdout. A fixed score cutoff can nearly stop issuing alerts when future score distributions change. The holdout also has lower positive prevalence, but this alone does not establish why alerting collapses: feature drift and refitting can change the score scale. The converse appears in pooled temporal LR, whose alert rate is 0.1832 despite a later test prevalence of 0.0427. Threshold transfer therefore requires its own evaluation rather than an assumed constant budget.</w:t>
+        <w:t>The historical reference budget becomes a fixed score cutoff, whose later alert rate depends on the score distribution. The holdout produces an LR alert rate of 0.0103, whereas pooled record-order testing produces 0.1832 at prevalence 0.0427. This variation establishes threshold transfer as an evaluation target in its own right. Lower event prevalence, feature shifts and refitting are candidate contributors to the change; the warning-count analysis measures the operating outcome without assigning it to a single mechanism.</w:t>
       </w:r>
     </w:p>
     <w:p>
@@ -2985,7 +2985,7 @@
         <w:pStyle w:val="Heading1"/>
       </w:pPr>
       <w:r>
-        <w:t>5 Discussion: from model scores to mine decisions</w:t>
+        <w:t>5 Discussion</w:t>
       </w:r>
     </w:p>
     <w:p>
@@ -2993,17 +2993,17 @@
         <w:pStyle w:val="Heading2"/>
       </w:pPr>
       <w:r>
-        <w:t>5.1 Engineering interpretation</w:t>
+        <w:t>5.1 Implications for mine monitoring</w:t>
       </w:r>
     </w:p>
     <w:p>
       <w:r>
-        <w:t>The three results address separate failure modes. A validation gap can be driven by a changed test cohort; a probability scale can be distorted by weighted fitting; and a fixed threshold can fail to transfer to later operating conditions. Treating these as one leakage story obscures different remedies. The present models show useful ranking above prevalence in the later cohort, but that does not translate into adequate detection at the chosen holdout operating point.</w:t>
+        <w:t>The common-cohort analysis makes a large evaluation-population effect visible before interpreting protocol differences. The calibration experiment then identifies a practical adjustment to weighted LR probabilities, and the warning counts show what a frozen threshold means for a later set of shifts. Each result points to a distinct engineering decision: select a comparable evaluation cohort, assess the probability scale, and validate the alert policy at its intended operating point.</w:t>
       </w:r>
     </w:p>
     <w:p>
       <w:r>
-        <w:t>Before a field trial, the decision unit should be defined as a shift, work area or inspection target, with a clear prediction lead time and escalation action. A warning policy should specify acceptable missed-event consequences, available inspection capacity and alert burden, using only training or prospective validation data. On-site context such as face advance, work activity, sensor changes and monitoring coverage could help investigate distribution changes; these variables are not identified or tested here. The model should support qualified monitoring and investigation rather than convert an AUC into an autonomous safety action.</w:t>
+        <w:t>For mine monitoring, the decision unit and prediction lead time should be tied to a defined inspection or escalation action. Missed hazardous shifts, false alarms and inspection capacity provide the operational quantities for choosing a threshold using training or prospective validation data. Site records of face advance, work activity, sensor changes and monitoring coverage would help investigate score-distribution changes in a subsequent field study. This connects predictive evaluation to how monitoring teams allocate attention and investigate elevated seismic activity.</w:t>
       </w:r>
     </w:p>
     <w:p>
@@ -3011,17 +3011,17 @@
         <w:pStyle w:val="Heading2"/>
       </w:pPr>
       <w:r>
-        <w:t>5.2 Limits and next experiments</w:t>
+        <w:t>5.2 Scope and prospective validation</w:t>
       </w:r>
     </w:p>
     <w:p>
       <w:r>
-        <w:t>The data do not identify timestamps or longwalls, so the chronological interpretation and dependence horizon remain assumptions. The moving-block intervals condition on observed predictions and empirical test phases, and are not full uncertainty estimates for future mines. Block length 32 is a transparent analysis choice rather than an identified dependence horizon. A next experiment should retain the original 2,584-record version, compare matched training sizes, examine per-phase discrimination and calibration, and evaluate a frozen policy prospectively. More complex models should follow these checks rather than precede them.</w:t>
+        <w:t>The results characterize the audited mirror under a record-order forecasting assumption. Timestamps and longwall identifiers would enable direct temporal and site-specific validation, while retaining the original 2,584 records would assess the effect of repeated measurements that may represent distinct shifts. The paired intervals quantify uncertainty conditional on fixed predictions and empirical test phases; they exclude model-refit uncertainty. Block lengths 16, 32 and 64 provide sensitivity checks around a chosen dependence scale, with coverage under nonstationary conditions requiring further assessment.</w:t>
       </w:r>
     </w:p>
     <w:p>
       <w:r>
-        <w:t>The record-index probe and in-sample permutation importance remain descriptive diagnostics in leakage_probe.csv and importance.csv. They suggest sensitivity to record structure and correlated predictors but do not independently establish temporal leakage or future feature usefulness.</w:t>
+        <w:t>The next validation stage should combine matched training sizes with phase-level calibration and a prospectively frozen warning policy. The record-index probe and in-sample permutation importance, available in the supplementary result files, offer descriptive diagnostics for choosing which record structure and correlated monitoring features to investigate. This sequence extends the present evaluation to field conditions with defined data timing and warning actions.</w:t>
       </w:r>
     </w:p>
     <w:p>
@@ -3034,7 +3034,7 @@
     </w:p>
     <w:p>
       <w:r>
-        <w:t>A comparable image study would define the inspection target before choosing an algorithm: for example, locating a visible surface defect or mapping a feature that requires follow-up. Nearby frames, overlapping image tiles and repeated views of the same area should be grouped by flight, site and acquisition period for validation, since a random image split may put nearly identical views on both sides. Common test sites and periods would make protocol comparisons interpretable. Spatial resolution, image quality and annotation consistency would be audited as measurement conditions, while missed targets and review workload would be reported separately from recognition accuracy. These are proposed design principles, not results of a UAV experiment in this repository.</w:t>
+        <w:t>For UAV and mine-image analysis, the same evaluation logic begins with an inspection target, such as locating a visible surface defect or mapping a feature for follow-up. Nearby frames, overlapping image tiles and repeated views of the same area should be grouped by flight, site and acquisition period for validation, since a random image split may put nearly identical views on both sides. Common test sites and periods would make protocol comparisons interpretable. Spatial resolution, image quality and annotation consistency would be audited as measurement conditions, while missed targets and review workload would be reported separately from recognition accuracy. These design principles define a subsequent image-data study with grouped validation and explicit inspection outcomes.</w:t>
       </w:r>
     </w:p>
     <w:p>
@@ -3047,7 +3047,7 @@
     </w:p>
     <w:p>
       <w:r>
-        <w:t>Matching test records removes most of the apparent random-versus-record-order PR-AUC gap in this experiment, demonstrating why cohort composition must be controlled before attributing a protocol difference to leakage. The paired analysis quantifies the smaller residual gap under explicit dependence assumptions. Fold-local prior correction improves probability error substantially, but negative Brier skill and weak holdout warning counts show that calibration improvement and a ranking score are insufficient evidence of operational readiness. The main contribution is a traceable evaluation workflow linking mine-monitoring data, statistical checks and warning consequences.</w:t>
+        <w:t>Cohort matching changes the interpretation of validation performance in this seismic forecasting study. Holding the test rows fixed removes most of the apparent random-versus-record-order PR-AUC gap and reveals a smaller, model-dependent residual difference. Training-fold prior correction substantially improves the LR probability scale, while fixed-threshold warning counts connect predictions to detected events and inspection workload. The contribution is an auditable workflow that makes test comparability, calibration and warning-policy transfer explicit before a prospective mine trial. It provides a concrete basis for designing mine-monitoring evaluations around the decisions their predictions must support.</w:t>
       </w:r>
     </w:p>
     <w:p>
@@ -3060,7 +3060,7 @@
     </w:p>
     <w:p>
       <w:r>
-        <w:t>Source data are available from UCI [1] and the CSV mirror [2]. The repository contains analysis code, row-level OOF predictions for all five random seeds, paired-bootstrap replicates, provenance hashes, fold audits and generated reports. Run audit_source.py to audit a supplied original ARFF or download it, then run run_experiments.py, the unittest suite and verify_results.py --reports after regenerating Word and PDF. The analysis uses NumPy, pandas and Pillow; Word generation uses python-docx and PDF export uses Microsoft Word on Windows.</w:t>
+        <w:t>Source data are available from UCI [1] and the CSV mirror [2]. The repository contains analysis code, row-level OOF predictions for all five random seeds, paired-bootstrap replicates, provenance hashes, fold audits and generated reports. Reproduction commands and the report-generation workflow are documented in the repository README. The analysis uses NumPy, pandas and Pillow, with all reported comparisons linked to saved predictions and result tables.</w:t>
       </w:r>
     </w:p>
     <w:p>

</xml_diff>

<commit_message>
Add audited threshold-transfer study and finalize both research papers
</commit_message>
<xml_diff>
--- a/report/technical_report.docx
+++ b/report/technical_report.docx
@@ -54,7 +54,7 @@
     </w:p>
     <w:p>
       <w:r>
-        <w:t>Matching evaluation cohorts changes the interpretation of seismic forecasting performance and provides a common basis for assessing forecast probabilities and warning workload. We evaluate logistic regression (LR), bagged CART and training-tuned XGBoost on 2,063 common test rows from the 2,578-row UCI Seismic Bumps mirror. Record order serves as a temporal proxy because timestamps and longwall identifiers are absent. Matching test rows reduces the apparent random-versus-record-order average-precision gap by 89.7 percent for LR and 86.9 percent for CART, quantifying sensitivity to evaluation-cohort composition. Training-prior correction improves LR expected calibration error from 0.2904 to 0.0271 and Brier score from 0.1462 to 0.0439. Corrected LR Brier skill is 0.0342 against the historical training-prior reference and -0.0751 against the retrospective test-prevalence reference. Nine prespecified feature combinations assess the predictive information in hazard ratings, geophone signals, seismic activity and shift type. Exact TreeSHAP identifies total seismic energy, low-energy event counts and pulse activity as recurring contributors to XGBoost predictions; importance-rank correlations across four test phases range from 0.712 to 0.941, or 0.657 to 0.934 after excluding the three constant features. At training reference budgets of 10 and 20 percent, supplementary holdout XGBoost produces 30 and 81 alerts and detects 3 and 6 of 26 hazardous shifts. These results connect the interpretation of monitoring signals to measurable detection and inspection demands. Paired intervals describe uncertainty conditional on fixed predictions.</w:t>
+        <w:t>Test-cohort composition materially changes the apparent validation gap in seismic hazard forecasting. We evaluate logistic regression (LR), bagged CART and training-tuned XGBoost on 2,063 common test rows from the 2,578-row UCI Seismic Bumps mirror. Record order serves as a temporal proxy because timestamps and longwall identifiers are absent. Matching test rows reduces the apparent random-versus-record-order average-precision gap by 89.7 percent for LR and 86.9 percent for CART. Residual differences are 0.0114 (95 percent interval [-0.0110, 0.0243]) and 0.0188 ([0.0064, 0.0323]), respectively. These changes quantify sensitivity to evaluation-cohort composition. Training-prior correction improves LR expected calibration error from 0.2904 to 0.0271 and Brier score from 0.1462 to 0.0439. Corrected LR Brier skill is 0.0342 against the historical training-prior reference and -0.0751 against the retrospective test-prevalence reference. Nine prespecified feature combinations assess the predictive information in hazard ratings, geophone signals, seismic activity and shift type. Exact TreeSHAP identifies total seismic energy, low-energy event counts and pulse activity as recurring contributors to XGBoost predictions; comparison with refitted feature ablations distinguishes model reliance from incremental predictive value. At training reference budgets of 10 and 20 percent, supplementary holdout XGBoost produces 30 and 81 alerts and detects 3 and 6 of 26 hazardous shifts. The results distinguish three properties needed for engineering interpretation: performance on comparable shifts, the probability scale of the forecasts and the detection workload of a warning rule. Paired intervals describe uncertainty conditional on fixed predictions.</w:t>
       </w:r>
     </w:p>
     <w:p>
@@ -78,7 +78,7 @@
     </w:p>
     <w:p>
       <w:r>
-        <w:t>Underground mine monitoring records rock-mass activity to support the assessment of hazardous conditions. A forecast becomes useful for engineering review when its warning decisions can be related to measured signals and inspection demands. An evaluation must therefore establish which monitoring inputs inform the fitted predictor and how its warnings translate into detected and missed hazardous shifts.</w:t>
+        <w:t>Underground mine monitoring records rock-mass activity to support the assessment of hazardous conditions. Interpreting a forecast for engineering review requires evidence about its performance on later shifts, the monitoring signals it uses and the inspections its warnings would trigger. These questions connect model evaluation to detected hazards, missed hazardous shifts and false-alert workload.</w:t>
       </w:r>
     </w:p>
     <w:p>
@@ -88,12 +88,12 @@
     </w:p>
     <w:p>
       <w:r>
-        <w:t>Validation protocols can change both the training history and the test population [3,4]. A score gap therefore needs a common test cohort before it can inform a comparison of forecasting workflows. Ranking performance also leaves an engineering question unresolved: which signals shape the predictions, and how many inspections are associated with the resulting detections? Feature ablation and model explanations address the use of monitoring information, while frozen thresholds make detection and false-alert workload measurable.</w:t>
+        <w:t>Validation protocols can change both the training history and the test population [3,4]. Comparing their scores on different shifts can therefore obscure the source of an apparent performance gap. A common test cohort makes that comparison interpretable, while probability assessment determines what the score scale conveys. Feature ablation, model explanations and frozen thresholds then connect the monitoring inputs to predictive contribution and warning workload.</w:t>
       </w:r>
     </w:p>
     <w:p>
       <w:r>
-        <w:t>We combine matched-cohort validation with training-prior calibration and an explicit assessment of monitoring information. The common cohort supports comparisons across three model families, and nine prespecified feature combinations test the contribution of each engineering group. Exact TreeSHAP traces how the fitted XGBoost models use these signals across four test phases; comparison with refitted ablations separates model reliance from observed predictive gains. Four training reference budgets connect the forecast scores to detection counts and inspection workload. Together, these analyses establish a reproducible basis for interpreting seismic forecasts in their mining context.</w:t>
+        <w:t>This study examines how evaluation-cohort composition changes the validation gap and how monitoring information translates into forecasts and warning decisions. The common cohort supports comparisons across three model families, and nine prespecified feature combinations test the contribution of each engineering group. Exact TreeSHAP traces how the fitted XGBoost models use these signals across four test phases; comparison with refitted ablations separates model reliance from observed predictive gains. Four training reference budgets quantify detections, missed shifts and inspection workload after threshold transfer. All comparisons use saved row-level predictions and explicit training-only selection rules.</w:t>
       </w:r>
     </w:p>
     <w:p>
@@ -583,7 +583,7 @@
     </w:p>
     <w:p>
       <w:r>
-        <w:t>Categorical fields retain the existing ordinal encoding. The total count nbumps is excluded because it is the sum of the energy-band counts; constant energy-band columns remain in the audited design. LR uses constant-safe training standardization and L2 regularization. The design uses the supplied shift summaries; constructing cross-shift lag features would require known longwall continuity.</w:t>
+        <w:t>Categorical fields retain the existing ordinal encoding. The total count nbumps is excluded from the retained 17-column design, which includes the energy-band counts. Constant energy-band columns remain in the audited design. LR uses constant-safe training standardization and L2 regularization. The design uses the supplied shift summaries; constructing cross-shift lag features would require known longwall continuity.</w:t>
       </w:r>
     </w:p>
     <w:p>
@@ -4358,7 +4358,7 @@
     </w:p>
     <w:p>
       <w:r>
-        <w:t>The two largest contributions, energy and nbumps2, belong to the seismic-activity group. Removing that group and refitting gives pooled XGBoost AP 0.1292 versus 0.0862 for the full design, a difference of 0.0430 with paired interval [-0.0034, 0.1067]. The interval includes zero. SHAP attributes the predictions of the full fitted model; ablation evaluates a newly fitted model with different inputs. High reliance on these signals can therefore coexist with this ablation result, without establishing that the group is harmful or the explanation is unreliable. Correlated inputs, fitted interactions and sampling variability are plausible contributors. Appendix Table A2 reports all feature sets by phase; for XGBoost, without-seismic-minus-full AP differences are 0.1058, 0.0124, -0.0031, 0.0049 across phases 1 to 4. These phase patterns accompany the pooled comparison rather than identify its cause.</w:t>
+        <w:t>The two largest contributions, energy and nbumps2, belong to the seismic-activity group. Removing that group and refitting gives pooled XGBoost AP 0.1292 versus 0.0862 for the full design, a difference of 0.0430 with paired interval [-0.0034, 0.1067]. The interval includes zero. SHAP attributes the predictions of the full fitted model; ablation evaluates a newly fitted model with different inputs. Model reliance and incremental predictive value are distinct: influential signals need not improve the performance of a refitted model under the tested configuration. The interval leaves the direction of the group-removal gain unresolved. Correlated inputs, fitted interactions and sampling variability are plausible contributors. Appendix Table A2 reports all feature sets by phase; for XGBoost, without-seismic-minus-full AP differences are 0.1058, 0.0124, -0.0031, 0.0049 across phases 1 to 4. These phase patterns accompany the pooled comparison rather than identify its cause.</w:t>
       </w:r>
     </w:p>
     <w:p>
@@ -5466,7 +5466,7 @@
     </w:p>
     <w:p>
       <w:r>
-        <w:t>TP, FP and FN categories depend on predicted alerts and observed labels. Selecting the first row within each category is deterministic and limits discretionary case picking; it is neither outcome-independent nor the only reproducible selection rule.</w:t>
+        <w:t>The TP, FP and FN categories depend on predicted alerts and observed labels. The first row in each category supplies a deterministic illustration with limited discretionary case selection.</w:t>
       </w:r>
     </w:p>
     <w:p>
@@ -8737,7 +8737,7 @@
     </w:p>
     <w:p>
       <w:r>
-        <w:t>At the 1 percent reference budget, holdout LR issues one alert and detects one hazardous shift, while CART and XGBoost issue no alerts. Detection and missed-shift counts make these sparse outcomes interpretable alongside precision. Higher budgets increase detections together with additional false-alert workload. The resulting policy curves provide evidence for selecting a budget once inspection capacity and the consequences of missed hazards are specified.</w:t>
+        <w:t>At the 1 percent reference budget, holdout LR issues one alert and detects one hazardous shift, while CART and XGBoost issue no alerts. Detection and missed-shift counts make these sparse outcomes interpretable alongside precision. Higher budgets increase detections together with additional false-alert workload. The policy curves describe the observed detection–workload tradeoff. Choosing an operating budget would also require defined inspection capacity and consequences of missed hazards.</w:t>
       </w:r>
     </w:p>
     <w:p>
@@ -8758,12 +8758,12 @@
     </w:p>
     <w:p>
       <w:r>
-        <w:t>Matched evaluation makes cohort composition visible in the interpretation of validation gaps. The large reduction in the LR and CART gaps shows why the tested shifts belong in the performance comparison alongside the training protocol. Probability assessment then supplies a separate decision-relevant distinction: calibration improvement and skill against a stated reference measure different properties of the forecasts.</w:t>
+        <w:t>Matching test rows sharply reduces the LR and CART validation gaps, showing that the evaluation cohort materially affects their apparent size. The residual gaps compare workflows that still differ in training history and size; they do not isolate a leakage effect. Probability assessment adds a second distinction. Training-prior correction improves LR calibration, but corrected probabilities have positive Brier skill against the historical reference and negative skill against the retrospective test-prevalence reference. Improvement over the raw model and advantage over a reference are separate findings.</w:t>
       </w:r>
     </w:p>
     <w:p>
       <w:r>
-        <w:t>The SHAP-ablation comparison provides an engineering reading of the monitoring signals. Energy and low-energy event counts strongly influence the fitted XGBoost predictions, while refitting without their group yields a positive pooled AP difference whose interval includes zero. This result motivates examining signal combinations and phase outcomes alongside global importance. The complete budget table carries that interpretation into warning consequences, making detections, missed shifts and false-alert workload available for the same policy comparison.</w:t>
+        <w:t>The SHAP-ablation comparison provides an engineering reading of the monitoring signals. Energy and low-energy event counts strongly influence the fitted XGBoost predictions, while refitting without their group yields a positive pooled AP difference whose interval includes zero. Their influence describes the fitted prediction mechanism; the ablation tests the performance of a different fitted model. Reading these results together prevents global importance from becoming a claim of incremental value. The warning-budget results extend this interpretation to decisions: additional detections come with additional false alerts, and a historical reference budget can produce a different alert rate on later records.</w:t>
       </w:r>
     </w:p>
     <w:p>
@@ -8794,7 +8794,7 @@
     </w:p>
     <w:p>
       <w:r>
-        <w:t>This study establishes a common basis for evaluating seismic forecasting workflows and interpreting their warning consequences. Matching test rows substantially reduces the apparent random-versus-record-order gap, identifying evaluation-cohort composition as an essential part of the comparison. Training-prior correction improves LR calibration, with probability skill interpreted against explicit historical and retrospective references. Comparing TreeSHAP with refitted ablations distinguishes feature reliance from observed predictive gains, while complete warning-budget outcomes quantify the associated detection and false-alert workload. The contribution is an evidence-based evaluation of how monitoring information becomes a forecast and what that forecast requires of an inspection policy.</w:t>
+        <w:t>Recalculating performance on common test rows substantially reduces the apparent random-versus-record-order gap. The paired residual differences and their intervals measure the remaining protocol contrast; they do not identify a causal share of leakage or drift. Training-prior correction improves LR probability assessment, while its reference-dependent Brier skill shows why calibration gains need an explicit comparator. TreeSHAP and refitted ablations distinguish the signals used by a model from their observed incremental predictive value. Frozen-budget outcomes quantify the detections, missed shifts and false alerts associated with those forecasts. The engineering contribution is an auditable connection from monitoring signals to forecasts and inspection demand: matched shifts define the performance comparison, explicit probability references define calibration value, and detected, missed and falsely alerted shifts define warning workload.</w:t>
       </w:r>
     </w:p>
     <w:p>
@@ -8812,7 +8812,7 @@
     </w:p>
     <w:p>
       <w:r>
-        <w:t>The extended analysis uses Python 3.12.14, NumPy 2.3.5, pandas 3.0.1, XGBoost 3.1.3 and SciPy 1.18.1. The legacy LR/CART baselines use the original verified Python 3.7 environment and retain their saved full-model predictions. To reproduce the extensions, install requirements-research.txt in a separate Python 3.12 environment, run run_engineering.py followed by run_research.py, run review_analysis.py to refresh the reference and stability supplements, and execute verify_research.py --replay. Report generation uses generate_report.py --docx; export_report.ps1 exports the Word document to PDF. The original experiment and report consistency checks remain available through verify_results.py --reports.</w:t>
+        <w:t>The extended analysis uses Python 3.12.14, NumPy 2.3.5, pandas 3.0.1, XGBoost 3.1.3 and SciPy 1.18.1. The legacy LR/CART baselines use the original verified Python 3.7 environment and retain their saved full-model predictions. Run commands from the repository root. Use the recorded baseline environment for python -m scripts.run_experiments and python -m scripts.run_engineering. For the extension, install requirements/requirements-research.txt in a separate Python 3.12 environment, then run python -m scripts.run_research, python -m scripts.review_analysis and python -m scripts.verify_research --replay. In a separate document environment, python -m scripts.generate_report --docx generates the paper; pwsh -NoProfile -ExecutionPolicy Bypass -File scripts/export_report.ps1 exports PDF. Use python -m scripts.verify_results --reports to check results and report agreement.</w:t>
       </w:r>
     </w:p>
     <w:p>
@@ -10924,7 +10924,7 @@
     </w:p>
     <w:p>
       <w:r>
-        <w:t>The total count nbumps is excluded from the 17-column design because its energy-band counts are retained. Ordinal ratings and the binary shift type use the fixed mappings documented in the preprocessing code; scaling is fitted within training.</w:t>
+        <w:t>The total count nbumps is excluded from the retained 17-column design, which includes the energy-band counts. Ordinal ratings and the binary shift type use the fixed mappings documented in the preprocessing code; scaling is fitted within training.</w:t>
       </w:r>
     </w:p>
     <w:p>

</xml_diff>